<commit_message>
adding read me file
</commit_message>
<xml_diff>
--- a/Readme_HW2.docx
+++ b/Readme_HW2.docx
@@ -92,26 +92,6 @@
         </w:rPr>
         <w:t>(G01481312) - lvissapr@gmu.edu</w:t>
       </w:r>
-    </w:p>
-    <w:p>
-      <w:pPr>
-        <w:pStyle w:val="Heading1"/>
-        <w:spacing w:before="253"/>
-        <w:ind w:left="360"/>
-        <w:rPr>
-          <w:rFonts w:ascii="Times New Roman" w:hAnsi="Times New Roman" w:cs="Times New Roman"/>
-          <w:b w:val="0"/>
-          <w:bCs w:val="0"/>
-        </w:rPr>
-      </w:pPr>
-    </w:p>
-    <w:p>
-      <w:pPr>
-        <w:pStyle w:val="BodyText"/>
-        <w:rPr>
-          <w:rFonts w:ascii="Times New Roman" w:hAnsi="Times New Roman" w:cs="Times New Roman"/>
-        </w:rPr>
-      </w:pPr>
     </w:p>
     <w:p>
       <w:pPr>
@@ -952,6 +932,90 @@
         <w:spacing w:before="61"/>
         <w:rPr>
           <w:rFonts w:ascii="Times New Roman" w:hAnsi="Times New Roman" w:cs="Times New Roman"/>
+          <w:spacing w:val="-4"/>
+          <w:sz w:val="24"/>
+        </w:rPr>
+      </w:pPr>
+      <w:r>
+        <w:rPr>
+          <w:rFonts w:ascii="Times New Roman" w:hAnsi="Times New Roman" w:cs="Times New Roman"/>
+          <w:spacing w:val="-4"/>
+          <w:sz w:val="24"/>
+        </w:rPr>
+        <w:t xml:space="preserve">                            </w:t>
+      </w:r>
+      <w:r>
+        <w:rPr>
+          <w:rFonts w:ascii="Times New Roman" w:hAnsi="Times New Roman" w:cs="Times New Roman"/>
+          <w:spacing w:val="-4"/>
+          <w:sz w:val="24"/>
+        </w:rPr>
+        <w:t>docker</w:t>
+      </w:r>
+      <w:r>
+        <w:rPr>
+          <w:rFonts w:ascii="Times New Roman" w:hAnsi="Times New Roman" w:cs="Times New Roman"/>
+          <w:spacing w:val="-22"/>
+          <w:sz w:val="24"/>
+        </w:rPr>
+        <w:t xml:space="preserve"> </w:t>
+      </w:r>
+      <w:r>
+        <w:rPr>
+          <w:rFonts w:ascii="Times New Roman" w:hAnsi="Times New Roman" w:cs="Times New Roman"/>
+          <w:spacing w:val="-4"/>
+          <w:sz w:val="24"/>
+        </w:rPr>
+        <w:t>push</w:t>
+      </w:r>
+      <w:r>
+        <w:rPr>
+          <w:rFonts w:ascii="Times New Roman" w:hAnsi="Times New Roman" w:cs="Times New Roman"/>
+          <w:spacing w:val="-18"/>
+          <w:sz w:val="24"/>
+        </w:rPr>
+        <w:t xml:space="preserve"> </w:t>
+      </w:r>
+      <w:r>
+        <w:rPr>
+          <w:rFonts w:ascii="Times New Roman" w:hAnsi="Times New Roman" w:cs="Times New Roman"/>
+          <w:spacing w:val="-4"/>
+          <w:sz w:val="24"/>
+        </w:rPr>
+        <w:t>sankari1205/swe645-hw</w:t>
+      </w:r>
+      <w:proofErr w:type="gramStart"/>
+      <w:r>
+        <w:rPr>
+          <w:rFonts w:ascii="Times New Roman" w:hAnsi="Times New Roman" w:cs="Times New Roman"/>
+          <w:spacing w:val="-4"/>
+          <w:sz w:val="24"/>
+        </w:rPr>
+        <w:t>2:latest</w:t>
+      </w:r>
+      <w:proofErr w:type="gramEnd"/>
+    </w:p>
+    <w:p>
+      <w:pPr>
+        <w:tabs>
+          <w:tab w:val="left" w:pos="3599"/>
+        </w:tabs>
+        <w:spacing w:before="61"/>
+        <w:rPr>
+          <w:rFonts w:ascii="Times New Roman" w:hAnsi="Times New Roman" w:cs="Times New Roman"/>
+          <w:spacing w:val="-4"/>
+          <w:sz w:val="24"/>
+        </w:rPr>
+      </w:pPr>
+    </w:p>
+    <w:p>
+      <w:pPr>
+        <w:tabs>
+          <w:tab w:val="left" w:pos="3599"/>
+        </w:tabs>
+        <w:spacing w:before="61"/>
+        <w:rPr>
+          <w:rFonts w:ascii="Times New Roman" w:hAnsi="Times New Roman" w:cs="Times New Roman"/>
           <w:sz w:val="24"/>
         </w:rPr>
         <w:sectPr>
@@ -964,80 +1028,11 @@
       <w:r>
         <w:rPr>
           <w:rFonts w:ascii="Times New Roman" w:hAnsi="Times New Roman" w:cs="Times New Roman"/>
-          <w:spacing w:val="-4"/>
-          <w:sz w:val="24"/>
-        </w:rPr>
-        <w:t xml:space="preserve">                            </w:t>
-      </w:r>
-      <w:r>
-        <w:rPr>
-          <w:rFonts w:ascii="Times New Roman" w:hAnsi="Times New Roman" w:cs="Times New Roman"/>
-          <w:spacing w:val="-4"/>
-          <w:sz w:val="24"/>
-        </w:rPr>
-        <w:t>docker</w:t>
-      </w:r>
-      <w:r>
-        <w:rPr>
-          <w:rFonts w:ascii="Times New Roman" w:hAnsi="Times New Roman" w:cs="Times New Roman"/>
-          <w:spacing w:val="-22"/>
-          <w:sz w:val="24"/>
-        </w:rPr>
-        <w:t xml:space="preserve"> </w:t>
-      </w:r>
-      <w:r>
-        <w:rPr>
-          <w:rFonts w:ascii="Times New Roman" w:hAnsi="Times New Roman" w:cs="Times New Roman"/>
-          <w:spacing w:val="-4"/>
-          <w:sz w:val="24"/>
-        </w:rPr>
-        <w:t>push</w:t>
-      </w:r>
-      <w:r>
-        <w:rPr>
-          <w:rFonts w:ascii="Times New Roman" w:hAnsi="Times New Roman" w:cs="Times New Roman"/>
-          <w:spacing w:val="-18"/>
-          <w:sz w:val="24"/>
-        </w:rPr>
-        <w:t xml:space="preserve"> </w:t>
-      </w:r>
-      <w:r>
-        <w:rPr>
-          <w:rFonts w:ascii="Times New Roman" w:hAnsi="Times New Roman" w:cs="Times New Roman"/>
-          <w:spacing w:val="-4"/>
-          <w:sz w:val="24"/>
-        </w:rPr>
-        <w:t>sankari1205/swe645-hw</w:t>
-      </w:r>
-      <w:proofErr w:type="gramStart"/>
-      <w:r>
-        <w:rPr>
-          <w:rFonts w:ascii="Times New Roman" w:hAnsi="Times New Roman" w:cs="Times New Roman"/>
-          <w:spacing w:val="-4"/>
-          <w:sz w:val="24"/>
-        </w:rPr>
-        <w:t>2:latest</w:t>
-      </w:r>
-      <w:proofErr w:type="gramEnd"/>
-    </w:p>
-    <w:p>
-      <w:pPr>
-        <w:pStyle w:val="BodyText"/>
-        <w:ind w:left="360"/>
-        <w:rPr>
-          <w:rFonts w:ascii="Times New Roman" w:hAnsi="Times New Roman" w:cs="Times New Roman"/>
-          <w:sz w:val="20"/>
-        </w:rPr>
-      </w:pPr>
-      <w:r>
-        <w:rPr>
-          <w:rFonts w:ascii="Times New Roman" w:hAnsi="Times New Roman" w:cs="Times New Roman"/>
           <w:noProof/>
           <w:sz w:val="20"/>
         </w:rPr>
-        <w:lastRenderedPageBreak/>
         <w:drawing>
-          <wp:inline distT="0" distB="0" distL="0" distR="0" wp14:anchorId="060A277E" wp14:editId="71B46967">
+          <wp:inline distT="0" distB="0" distL="0" distR="0" wp14:anchorId="6E278621" wp14:editId="7191D179">
             <wp:extent cx="6400800" cy="1920240"/>
             <wp:effectExtent l="0" t="0" r="0" b="0"/>
             <wp:docPr id="1732033297" name="Picture 1" descr="A screenshot of a computer&#10;&#10;AI-generated content may be incorrect."/>
@@ -1076,6 +1071,15 @@
     <w:p>
       <w:pPr>
         <w:pStyle w:val="BodyText"/>
+        <w:rPr>
+          <w:rFonts w:ascii="Times New Roman" w:hAnsi="Times New Roman" w:cs="Times New Roman"/>
+          <w:sz w:val="20"/>
+        </w:rPr>
+      </w:pPr>
+    </w:p>
+    <w:p>
+      <w:pPr>
+        <w:pStyle w:val="BodyText"/>
         <w:ind w:left="360"/>
         <w:rPr>
           <w:rFonts w:ascii="Times New Roman" w:hAnsi="Times New Roman" w:cs="Times New Roman"/>
@@ -1116,157 +1120,28 @@
         </w:tabs>
         <w:spacing w:before="148"/>
         <w:ind w:left="607"/>
-        <w:jc w:val="right"/>
-        <w:rPr>
-          <w:rFonts w:ascii="Times New Roman" w:hAnsi="Times New Roman" w:cs="Times New Roman"/>
-        </w:rPr>
-      </w:pPr>
-    </w:p>
-    <w:p>
-      <w:pPr>
-        <w:pStyle w:val="BodyText"/>
-        <w:spacing w:before="212"/>
-        <w:ind w:left="1080"/>
-        <w:rPr>
-          <w:rFonts w:ascii="Times New Roman" w:hAnsi="Times New Roman" w:cs="Times New Roman"/>
-        </w:rPr>
-      </w:pPr>
-      <w:r>
-        <w:rPr>
-          <w:rFonts w:ascii="Times New Roman" w:hAnsi="Times New Roman" w:cs="Times New Roman"/>
-          <w:spacing w:val="-2"/>
-        </w:rPr>
-        <w:t>Install</w:t>
-      </w:r>
-      <w:r>
-        <w:rPr>
-          <w:rFonts w:ascii="Times New Roman" w:hAnsi="Times New Roman" w:cs="Times New Roman"/>
-          <w:spacing w:val="-19"/>
-        </w:rPr>
-        <w:t xml:space="preserve"> </w:t>
-      </w:r>
-      <w:r>
-        <w:rPr>
-          <w:rFonts w:ascii="Times New Roman" w:hAnsi="Times New Roman" w:cs="Times New Roman"/>
-          <w:spacing w:val="-2"/>
-        </w:rPr>
-        <w:t>Docker</w:t>
-      </w:r>
-      <w:r>
-        <w:rPr>
-          <w:rFonts w:ascii="Times New Roman" w:hAnsi="Times New Roman" w:cs="Times New Roman"/>
-          <w:spacing w:val="-13"/>
-        </w:rPr>
-        <w:t xml:space="preserve"> </w:t>
-      </w:r>
-      <w:r>
-        <w:rPr>
-          <w:rFonts w:ascii="Times New Roman" w:hAnsi="Times New Roman" w:cs="Times New Roman"/>
-          <w:spacing w:val="-2"/>
-        </w:rPr>
-        <w:t>on</w:t>
-      </w:r>
-      <w:r>
-        <w:rPr>
-          <w:rFonts w:ascii="Times New Roman" w:hAnsi="Times New Roman" w:cs="Times New Roman"/>
-          <w:spacing w:val="-20"/>
-        </w:rPr>
-        <w:t xml:space="preserve"> </w:t>
-      </w:r>
-      <w:r>
-        <w:rPr>
-          <w:rFonts w:ascii="Times New Roman" w:hAnsi="Times New Roman" w:cs="Times New Roman"/>
-          <w:spacing w:val="-2"/>
-        </w:rPr>
-        <w:t>Rancher</w:t>
-      </w:r>
-      <w:r>
-        <w:rPr>
-          <w:rFonts w:ascii="Times New Roman" w:hAnsi="Times New Roman" w:cs="Times New Roman"/>
-          <w:spacing w:val="-19"/>
-        </w:rPr>
-        <w:t xml:space="preserve"> </w:t>
-      </w:r>
-      <w:r>
-        <w:rPr>
-          <w:rFonts w:ascii="Times New Roman" w:hAnsi="Times New Roman" w:cs="Times New Roman"/>
-          <w:spacing w:val="-2"/>
-        </w:rPr>
-        <w:t>instance</w:t>
-      </w:r>
-      <w:r>
-        <w:rPr>
-          <w:rFonts w:ascii="Times New Roman" w:hAnsi="Times New Roman" w:cs="Times New Roman"/>
-          <w:spacing w:val="-18"/>
-        </w:rPr>
-        <w:t xml:space="preserve"> </w:t>
-      </w:r>
-      <w:r>
-        <w:rPr>
-          <w:rFonts w:ascii="Times New Roman" w:hAnsi="Times New Roman" w:cs="Times New Roman"/>
-          <w:spacing w:val="-2"/>
-        </w:rPr>
-        <w:t>in</w:t>
-      </w:r>
-      <w:r>
-        <w:rPr>
-          <w:rFonts w:ascii="Times New Roman" w:hAnsi="Times New Roman" w:cs="Times New Roman"/>
-          <w:spacing w:val="-19"/>
-        </w:rPr>
-        <w:t xml:space="preserve"> </w:t>
-      </w:r>
-      <w:r>
-        <w:rPr>
-          <w:rFonts w:ascii="Times New Roman" w:hAnsi="Times New Roman" w:cs="Times New Roman"/>
-          <w:spacing w:val="-5"/>
-        </w:rPr>
-        <w:t>ec2</w:t>
-      </w:r>
-    </w:p>
-    <w:p>
-      <w:pPr>
-        <w:pStyle w:val="Heading1"/>
-        <w:spacing w:before="49"/>
-        <w:ind w:left="1080"/>
-        <w:rPr>
-          <w:rFonts w:ascii="Times New Roman" w:hAnsi="Times New Roman" w:cs="Times New Roman"/>
-        </w:rPr>
-      </w:pPr>
-      <w:r>
-        <w:rPr>
-          <w:rFonts w:ascii="Times New Roman" w:hAnsi="Times New Roman" w:cs="Times New Roman"/>
-          <w:w w:val="90"/>
-        </w:rPr>
-        <w:t>Launch</w:t>
-      </w:r>
-      <w:r>
-        <w:rPr>
-          <w:rFonts w:ascii="Times New Roman" w:hAnsi="Times New Roman" w:cs="Times New Roman"/>
-          <w:spacing w:val="-6"/>
-        </w:rPr>
-        <w:t xml:space="preserve"> </w:t>
-      </w:r>
-      <w:r>
-        <w:rPr>
-          <w:rFonts w:ascii="Times New Roman" w:hAnsi="Times New Roman" w:cs="Times New Roman"/>
-          <w:w w:val="90"/>
-        </w:rPr>
-        <w:t>EC2</w:t>
-      </w:r>
-      <w:r>
-        <w:rPr>
-          <w:rFonts w:ascii="Times New Roman" w:hAnsi="Times New Roman" w:cs="Times New Roman"/>
-          <w:spacing w:val="-7"/>
-        </w:rPr>
-        <w:t xml:space="preserve"> </w:t>
-      </w:r>
-      <w:r>
-        <w:rPr>
-          <w:rFonts w:ascii="Times New Roman" w:hAnsi="Times New Roman" w:cs="Times New Roman"/>
-          <w:spacing w:val="-2"/>
-          <w:w w:val="90"/>
-        </w:rPr>
-        <w:t>instance</w:t>
+        <w:rPr>
+          <w:rFonts w:ascii="Times New Roman" w:hAnsi="Times New Roman" w:cs="Times New Roman"/>
+          <w:b w:val="0"/>
+          <w:bCs w:val="0"/>
+        </w:rPr>
+      </w:pPr>
+      <w:r>
+        <w:rPr>
+          <w:rFonts w:ascii="Times New Roman" w:hAnsi="Times New Roman" w:cs="Times New Roman"/>
+          <w:b w:val="0"/>
+          <w:bCs w:val="0"/>
+        </w:rPr>
+        <w:t xml:space="preserve">Now open the docker on Rancher instance in EC2. </w:t>
+      </w:r>
+      <w:r>
+        <w:rPr>
+          <w:rFonts w:ascii="Times New Roman" w:hAnsi="Times New Roman" w:cs="Times New Roman"/>
+          <w:b w:val="0"/>
+          <w:bCs w:val="0"/>
+        </w:rPr>
+        <w:br/>
+        <w:t>Follow the below steps for launching EC2 instance</w:t>
       </w:r>
     </w:p>
     <w:p>
@@ -1748,70 +1623,15 @@
     </w:p>
     <w:p>
       <w:pPr>
-        <w:pStyle w:val="BodyText"/>
-        <w:spacing w:before="4"/>
-        <w:rPr>
-          <w:rFonts w:ascii="Times New Roman" w:hAnsi="Times New Roman" w:cs="Times New Roman"/>
-          <w:sz w:val="15"/>
-        </w:rPr>
-      </w:pPr>
-      <w:r>
-        <w:rPr>
-          <w:rFonts w:ascii="Times New Roman" w:hAnsi="Times New Roman" w:cs="Times New Roman"/>
-          <w:noProof/>
-          <w:sz w:val="15"/>
-        </w:rPr>
-        <w:drawing>
-          <wp:anchor distT="0" distB="0" distL="0" distR="0" simplePos="0" relativeHeight="487587840" behindDoc="1" locked="0" layoutInCell="1" allowOverlap="1" wp14:anchorId="5ECBEE03" wp14:editId="5076D5F6">
-            <wp:simplePos x="0" y="0"/>
-            <wp:positionH relativeFrom="page">
-              <wp:posOffset>911352</wp:posOffset>
-            </wp:positionH>
-            <wp:positionV relativeFrom="paragraph">
-              <wp:posOffset>132879</wp:posOffset>
-            </wp:positionV>
-            <wp:extent cx="5949695" cy="2950464"/>
-            <wp:effectExtent l="0" t="0" r="0" b="0"/>
-            <wp:wrapTopAndBottom/>
-            <wp:docPr id="2" name="Image 2"/>
-            <wp:cNvGraphicFramePr>
-              <a:graphicFrameLocks xmlns:a="http://schemas.openxmlformats.org/drawingml/2006/main"/>
-            </wp:cNvGraphicFramePr>
-            <a:graphic xmlns:a="http://schemas.openxmlformats.org/drawingml/2006/main">
-              <a:graphicData uri="http://schemas.openxmlformats.org/drawingml/2006/picture">
-                <pic:pic xmlns:pic="http://schemas.openxmlformats.org/drawingml/2006/picture">
-                  <pic:nvPicPr>
-                    <pic:cNvPr id="2" name="Image 2"/>
-                    <pic:cNvPicPr/>
-                  </pic:nvPicPr>
-                  <pic:blipFill>
-                    <a:blip r:embed="rId6" cstate="print"/>
-                    <a:stretch>
-                      <a:fillRect/>
-                    </a:stretch>
-                  </pic:blipFill>
-                  <pic:spPr>
-                    <a:xfrm>
-                      <a:off x="0" y="0"/>
-                      <a:ext cx="5949695" cy="2950464"/>
-                    </a:xfrm>
-                    <a:prstGeom prst="rect">
-                      <a:avLst/>
-                    </a:prstGeom>
-                  </pic:spPr>
-                </pic:pic>
-              </a:graphicData>
-            </a:graphic>
-          </wp:anchor>
-        </w:drawing>
-      </w:r>
-    </w:p>
-    <w:p>
-      <w:pPr>
-        <w:pStyle w:val="BodyText"/>
-        <w:spacing w:before="250"/>
-        <w:rPr>
-          <w:rFonts w:ascii="Times New Roman" w:hAnsi="Times New Roman" w:cs="Times New Roman"/>
+        <w:pStyle w:val="ListParagraph"/>
+        <w:tabs>
+          <w:tab w:val="left" w:pos="1799"/>
+        </w:tabs>
+        <w:spacing w:before="40"/>
+        <w:ind w:left="1799" w:firstLine="0"/>
+        <w:rPr>
+          <w:rFonts w:ascii="Times New Roman" w:hAnsi="Times New Roman" w:cs="Times New Roman"/>
+          <w:sz w:val="24"/>
         </w:rPr>
       </w:pPr>
     </w:p>
@@ -1841,20 +1661,7 @@
         <w:rPr>
           <w:rFonts w:ascii="Times New Roman" w:hAnsi="Times New Roman" w:cs="Times New Roman"/>
         </w:rPr>
-        <w:t>Install</w:t>
-      </w:r>
-      <w:r>
-        <w:rPr>
-          <w:rFonts w:ascii="Times New Roman" w:hAnsi="Times New Roman" w:cs="Times New Roman"/>
-          <w:spacing w:val="-28"/>
-        </w:rPr>
-        <w:t xml:space="preserve"> </w:t>
-      </w:r>
-      <w:r>
-        <w:rPr>
-          <w:rFonts w:ascii="Times New Roman" w:hAnsi="Times New Roman" w:cs="Times New Roman"/>
-        </w:rPr>
-        <w:t>Docker</w:t>
+        <w:t>install docker using the below command:</w:t>
       </w:r>
       <w:r>
         <w:rPr>
@@ -1863,11 +1670,59 @@
         </w:rPr>
         <w:t xml:space="preserve"> </w:t>
       </w:r>
-      <w:r>
-        <w:rPr>
-          <w:rFonts w:ascii="Times New Roman" w:hAnsi="Times New Roman" w:cs="Times New Roman"/>
-        </w:rPr>
-        <w:t>on</w:t>
+      <w:proofErr w:type="spellStart"/>
+      <w:r>
+        <w:rPr>
+          <w:rFonts w:ascii="Times New Roman" w:hAnsi="Times New Roman" w:cs="Times New Roman"/>
+        </w:rPr>
+        <w:t>sudo</w:t>
+      </w:r>
+      <w:proofErr w:type="spellEnd"/>
+      <w:r>
+        <w:rPr>
+          <w:rFonts w:ascii="Times New Roman" w:hAnsi="Times New Roman" w:cs="Times New Roman"/>
+        </w:rPr>
+        <w:t xml:space="preserve"> apt-get upda</w:t>
+      </w:r>
+      <w:r>
+        <w:rPr>
+          <w:rFonts w:ascii="Times New Roman" w:hAnsi="Times New Roman" w:cs="Times New Roman"/>
+        </w:rPr>
+        <w:t>te</w:t>
+      </w:r>
+    </w:p>
+    <w:p>
+      <w:pPr>
+        <w:pStyle w:val="BodyText"/>
+        <w:spacing w:before="65" w:line="280" w:lineRule="auto"/>
+        <w:ind w:left="1080" w:right="5393"/>
+        <w:rPr>
+          <w:rFonts w:ascii="Times New Roman" w:hAnsi="Times New Roman" w:cs="Times New Roman"/>
+          <w:spacing w:val="-2"/>
+        </w:rPr>
+      </w:pPr>
+      <w:proofErr w:type="spellStart"/>
+      <w:r>
+        <w:rPr>
+          <w:rFonts w:ascii="Times New Roman" w:hAnsi="Times New Roman" w:cs="Times New Roman"/>
+          <w:spacing w:val="-2"/>
+        </w:rPr>
+        <w:t>sudo</w:t>
+      </w:r>
+      <w:proofErr w:type="spellEnd"/>
+      <w:r>
+        <w:rPr>
+          <w:rFonts w:ascii="Times New Roman" w:hAnsi="Times New Roman" w:cs="Times New Roman"/>
+          <w:spacing w:val="-27"/>
+        </w:rPr>
+        <w:t xml:space="preserve"> </w:t>
+      </w:r>
+      <w:r>
+        <w:rPr>
+          <w:rFonts w:ascii="Times New Roman" w:hAnsi="Times New Roman" w:cs="Times New Roman"/>
+          <w:spacing w:val="-2"/>
+        </w:rPr>
+        <w:t>apt-get</w:t>
       </w:r>
       <w:r>
         <w:rPr>
@@ -1879,8 +1734,244 @@
       <w:r>
         <w:rPr>
           <w:rFonts w:ascii="Times New Roman" w:hAnsi="Times New Roman" w:cs="Times New Roman"/>
-        </w:rPr>
-        <w:t>Rancher</w:t>
+          <w:spacing w:val="-2"/>
+        </w:rPr>
+        <w:t>install</w:t>
+      </w:r>
+      <w:r>
+        <w:rPr>
+          <w:rFonts w:ascii="Times New Roman" w:hAnsi="Times New Roman" w:cs="Times New Roman"/>
+          <w:spacing w:val="-27"/>
+        </w:rPr>
+        <w:t xml:space="preserve"> </w:t>
+      </w:r>
+      <w:r>
+        <w:rPr>
+          <w:rFonts w:ascii="Times New Roman" w:hAnsi="Times New Roman" w:cs="Times New Roman"/>
+          <w:spacing w:val="-2"/>
+        </w:rPr>
+        <w:t>docker.io</w:t>
+      </w:r>
+      <w:r>
+        <w:rPr>
+          <w:rFonts w:ascii="Times New Roman" w:hAnsi="Times New Roman" w:cs="Times New Roman"/>
+          <w:spacing w:val="-30"/>
+        </w:rPr>
+        <w:t xml:space="preserve"> </w:t>
+      </w:r>
+      <w:r>
+        <w:rPr>
+          <w:rFonts w:ascii="Times New Roman" w:hAnsi="Times New Roman" w:cs="Times New Roman"/>
+          <w:spacing w:val="-2"/>
+        </w:rPr>
+        <w:t xml:space="preserve">-y </w:t>
+      </w:r>
+    </w:p>
+    <w:p>
+      <w:pPr>
+        <w:pStyle w:val="BodyText"/>
+        <w:spacing w:before="65" w:line="280" w:lineRule="auto"/>
+        <w:ind w:left="1080" w:right="5393"/>
+        <w:rPr>
+          <w:rFonts w:ascii="Times New Roman" w:hAnsi="Times New Roman" w:cs="Times New Roman"/>
+        </w:rPr>
+      </w:pPr>
+      <w:proofErr w:type="spellStart"/>
+      <w:r>
+        <w:rPr>
+          <w:rFonts w:ascii="Times New Roman" w:hAnsi="Times New Roman" w:cs="Times New Roman"/>
+        </w:rPr>
+        <w:t>sudo</w:t>
+      </w:r>
+      <w:proofErr w:type="spellEnd"/>
+      <w:r>
+        <w:rPr>
+          <w:rFonts w:ascii="Times New Roman" w:hAnsi="Times New Roman" w:cs="Times New Roman"/>
+        </w:rPr>
+        <w:t xml:space="preserve"> </w:t>
+      </w:r>
+      <w:proofErr w:type="spellStart"/>
+      <w:r>
+        <w:rPr>
+          <w:rFonts w:ascii="Times New Roman" w:hAnsi="Times New Roman" w:cs="Times New Roman"/>
+        </w:rPr>
+        <w:t>systemctl</w:t>
+      </w:r>
+      <w:proofErr w:type="spellEnd"/>
+      <w:r>
+        <w:rPr>
+          <w:rFonts w:ascii="Times New Roman" w:hAnsi="Times New Roman" w:cs="Times New Roman"/>
+        </w:rPr>
+        <w:t xml:space="preserve"> enable docker </w:t>
+      </w:r>
+    </w:p>
+    <w:p>
+      <w:pPr>
+        <w:pStyle w:val="BodyText"/>
+        <w:spacing w:before="65" w:line="280" w:lineRule="auto"/>
+        <w:ind w:left="1080" w:right="5393"/>
+        <w:rPr>
+          <w:rFonts w:ascii="Times New Roman" w:hAnsi="Times New Roman" w:cs="Times New Roman"/>
+        </w:rPr>
+      </w:pPr>
+      <w:proofErr w:type="spellStart"/>
+      <w:r>
+        <w:rPr>
+          <w:rFonts w:ascii="Times New Roman" w:hAnsi="Times New Roman" w:cs="Times New Roman"/>
+        </w:rPr>
+        <w:t>sudo</w:t>
+      </w:r>
+      <w:proofErr w:type="spellEnd"/>
+      <w:r>
+        <w:rPr>
+          <w:rFonts w:ascii="Times New Roman" w:hAnsi="Times New Roman" w:cs="Times New Roman"/>
+        </w:rPr>
+        <w:t xml:space="preserve"> </w:t>
+      </w:r>
+      <w:proofErr w:type="spellStart"/>
+      <w:r>
+        <w:rPr>
+          <w:rFonts w:ascii="Times New Roman" w:hAnsi="Times New Roman" w:cs="Times New Roman"/>
+        </w:rPr>
+        <w:t>systemctl</w:t>
+      </w:r>
+      <w:proofErr w:type="spellEnd"/>
+      <w:r>
+        <w:rPr>
+          <w:rFonts w:ascii="Times New Roman" w:hAnsi="Times New Roman" w:cs="Times New Roman"/>
+        </w:rPr>
+        <w:t xml:space="preserve"> start docker</w:t>
+      </w:r>
+    </w:p>
+    <w:p>
+      <w:pPr>
+        <w:pStyle w:val="BodyText"/>
+        <w:spacing w:before="65" w:line="280" w:lineRule="auto"/>
+        <w:ind w:left="1080" w:right="5393"/>
+        <w:rPr>
+          <w:rFonts w:ascii="Times New Roman" w:hAnsi="Times New Roman" w:cs="Times New Roman"/>
+        </w:rPr>
+      </w:pPr>
+    </w:p>
+    <w:p>
+      <w:pPr>
+        <w:pStyle w:val="BodyText"/>
+        <w:spacing w:before="65" w:line="280" w:lineRule="auto"/>
+        <w:ind w:left="1080" w:right="5393"/>
+        <w:rPr>
+          <w:rFonts w:ascii="Times New Roman" w:hAnsi="Times New Roman" w:cs="Times New Roman"/>
+          <w:b/>
+          <w:bCs/>
+        </w:rPr>
+      </w:pPr>
+      <w:r>
+        <w:rPr>
+          <w:rFonts w:ascii="Times New Roman" w:hAnsi="Times New Roman" w:cs="Times New Roman"/>
+          <w:b/>
+          <w:bCs/>
+        </w:rPr>
+        <w:t>Running Rancher in Docker:</w:t>
+      </w:r>
+    </w:p>
+    <w:p>
+      <w:pPr>
+        <w:rPr>
+          <w:rFonts w:ascii="Times New Roman" w:hAnsi="Times New Roman" w:cs="Times New Roman"/>
+        </w:rPr>
+      </w:pPr>
+      <w:r>
+        <w:rPr>
+          <w:rFonts w:ascii="Times New Roman" w:hAnsi="Times New Roman" w:cs="Times New Roman"/>
+        </w:rPr>
+        <w:t xml:space="preserve">                   </w:t>
+      </w:r>
+    </w:p>
+    <w:p>
+      <w:r>
+        <w:rPr>
+          <w:rFonts w:ascii="Times New Roman" w:hAnsi="Times New Roman" w:cs="Times New Roman"/>
+        </w:rPr>
+        <w:t xml:space="preserve">                   </w:t>
+      </w:r>
+      <w:r>
+        <w:rPr>
+          <w:rFonts w:ascii="Times New Roman" w:hAnsi="Times New Roman" w:cs="Times New Roman"/>
+        </w:rPr>
+        <w:t>Use the below command to run the rancher in docker</w:t>
+      </w:r>
+      <w:r>
+        <w:t>.</w:t>
+      </w:r>
+    </w:p>
+    <w:p>
+      <w:pPr>
+        <w:pStyle w:val="BodyText"/>
+        <w:spacing w:before="65" w:line="280" w:lineRule="auto"/>
+        <w:ind w:left="1080" w:right="5393"/>
+        <w:rPr>
+          <w:rFonts w:ascii="Times New Roman" w:hAnsi="Times New Roman" w:cs="Times New Roman"/>
+        </w:rPr>
+      </w:pPr>
+    </w:p>
+    <w:p>
+      <w:pPr>
+        <w:pStyle w:val="BodyText"/>
+        <w:spacing w:before="1"/>
+        <w:ind w:left="1177"/>
+        <w:rPr>
+          <w:rFonts w:ascii="Times New Roman" w:hAnsi="Times New Roman" w:cs="Times New Roman"/>
+        </w:rPr>
+      </w:pPr>
+      <w:proofErr w:type="spellStart"/>
+      <w:r>
+        <w:rPr>
+          <w:rFonts w:ascii="Times New Roman" w:hAnsi="Times New Roman" w:cs="Times New Roman"/>
+          <w:spacing w:val="-2"/>
+        </w:rPr>
+        <w:t>sudo</w:t>
+      </w:r>
+      <w:proofErr w:type="spellEnd"/>
+      <w:r>
+        <w:rPr>
+          <w:rFonts w:ascii="Times New Roman" w:hAnsi="Times New Roman" w:cs="Times New Roman"/>
+          <w:spacing w:val="-29"/>
+        </w:rPr>
+        <w:t xml:space="preserve"> </w:t>
+      </w:r>
+      <w:r>
+        <w:rPr>
+          <w:rFonts w:ascii="Times New Roman" w:hAnsi="Times New Roman" w:cs="Times New Roman"/>
+          <w:spacing w:val="-2"/>
+        </w:rPr>
+        <w:t>docker</w:t>
+      </w:r>
+      <w:r>
+        <w:rPr>
+          <w:rFonts w:ascii="Times New Roman" w:hAnsi="Times New Roman" w:cs="Times New Roman"/>
+          <w:spacing w:val="-23"/>
+        </w:rPr>
+        <w:t xml:space="preserve"> </w:t>
+      </w:r>
+      <w:r>
+        <w:rPr>
+          <w:rFonts w:ascii="Times New Roman" w:hAnsi="Times New Roman" w:cs="Times New Roman"/>
+          <w:spacing w:val="-2"/>
+        </w:rPr>
+        <w:t>run</w:t>
+      </w:r>
+      <w:r>
+        <w:rPr>
+          <w:rFonts w:ascii="Times New Roman" w:hAnsi="Times New Roman" w:cs="Times New Roman"/>
+          <w:spacing w:val="-26"/>
+        </w:rPr>
+        <w:t xml:space="preserve"> </w:t>
+      </w:r>
+      <w:r>
+        <w:rPr>
+          <w:rFonts w:ascii="Times New Roman" w:hAnsi="Times New Roman" w:cs="Times New Roman"/>
+          <w:spacing w:val="-2"/>
+        </w:rPr>
+        <w:t>-d</w:t>
       </w:r>
       <w:r>
         <w:rPr>
@@ -1892,34 +1983,589 @@
       <w:r>
         <w:rPr>
           <w:rFonts w:ascii="Times New Roman" w:hAnsi="Times New Roman" w:cs="Times New Roman"/>
-        </w:rPr>
-        <w:t>instance</w:t>
-      </w:r>
-      <w:r>
-        <w:rPr>
-          <w:rFonts w:ascii="Times New Roman" w:hAnsi="Times New Roman" w:cs="Times New Roman"/>
-          <w:spacing w:val="-27"/>
-        </w:rPr>
-        <w:t xml:space="preserve"> </w:t>
-      </w:r>
-      <w:r>
-        <w:rPr>
-          <w:rFonts w:ascii="Times New Roman" w:hAnsi="Times New Roman" w:cs="Times New Roman"/>
+          <w:spacing w:val="-2"/>
+        </w:rPr>
+        <w:t>--restart=unless-stopped</w:t>
+      </w:r>
+      <w:r>
+        <w:rPr>
+          <w:rFonts w:ascii="Times New Roman" w:hAnsi="Times New Roman" w:cs="Times New Roman"/>
+          <w:spacing w:val="-26"/>
+        </w:rPr>
+        <w:t xml:space="preserve"> </w:t>
+      </w:r>
+      <w:r>
+        <w:rPr>
+          <w:rFonts w:ascii="Times New Roman" w:hAnsi="Times New Roman" w:cs="Times New Roman"/>
+          <w:spacing w:val="-10"/>
+        </w:rPr>
+        <w:t>\</w:t>
+      </w:r>
+    </w:p>
+    <w:p>
+      <w:pPr>
+        <w:pStyle w:val="BodyText"/>
+        <w:spacing w:before="51"/>
+        <w:ind w:left="1177"/>
+        <w:rPr>
+          <w:rFonts w:ascii="Times New Roman" w:hAnsi="Times New Roman" w:cs="Times New Roman"/>
+        </w:rPr>
+      </w:pPr>
+      <w:r>
+        <w:rPr>
+          <w:rFonts w:ascii="Times New Roman" w:hAnsi="Times New Roman" w:cs="Times New Roman"/>
+          <w:spacing w:val="-6"/>
+        </w:rPr>
+        <w:t>-p</w:t>
+      </w:r>
+      <w:r>
+        <w:rPr>
+          <w:rFonts w:ascii="Times New Roman" w:hAnsi="Times New Roman" w:cs="Times New Roman"/>
+          <w:spacing w:val="-22"/>
+        </w:rPr>
+        <w:t xml:space="preserve"> </w:t>
+      </w:r>
+      <w:r>
+        <w:rPr>
+          <w:rFonts w:ascii="Times New Roman" w:hAnsi="Times New Roman" w:cs="Times New Roman"/>
+          <w:spacing w:val="-6"/>
+        </w:rPr>
+        <w:t>80:80</w:t>
+      </w:r>
+      <w:r>
+        <w:rPr>
+          <w:rFonts w:ascii="Times New Roman" w:hAnsi="Times New Roman" w:cs="Times New Roman"/>
+          <w:spacing w:val="-23"/>
+        </w:rPr>
+        <w:t xml:space="preserve"> </w:t>
+      </w:r>
+      <w:r>
+        <w:rPr>
+          <w:rFonts w:ascii="Times New Roman" w:hAnsi="Times New Roman" w:cs="Times New Roman"/>
+          <w:spacing w:val="-6"/>
+        </w:rPr>
+        <w:t>-p</w:t>
+      </w:r>
+      <w:r>
+        <w:rPr>
+          <w:rFonts w:ascii="Times New Roman" w:hAnsi="Times New Roman" w:cs="Times New Roman"/>
+          <w:spacing w:val="-24"/>
+        </w:rPr>
+        <w:t xml:space="preserve"> </w:t>
+      </w:r>
+      <w:r>
+        <w:rPr>
+          <w:rFonts w:ascii="Times New Roman" w:hAnsi="Times New Roman" w:cs="Times New Roman"/>
+          <w:spacing w:val="-6"/>
+        </w:rPr>
+        <w:t>443:443</w:t>
+      </w:r>
+      <w:r>
+        <w:rPr>
+          <w:rFonts w:ascii="Times New Roman" w:hAnsi="Times New Roman" w:cs="Times New Roman"/>
+          <w:spacing w:val="-25"/>
+        </w:rPr>
+        <w:t xml:space="preserve"> </w:t>
+      </w:r>
+      <w:r>
+        <w:rPr>
+          <w:rFonts w:ascii="Times New Roman" w:hAnsi="Times New Roman" w:cs="Times New Roman"/>
+          <w:spacing w:val="-10"/>
+        </w:rPr>
+        <w:t>\</w:t>
+      </w:r>
+    </w:p>
+    <w:p>
+      <w:pPr>
+        <w:pStyle w:val="BodyText"/>
+        <w:spacing w:before="48"/>
+        <w:ind w:left="1177"/>
+        <w:rPr>
+          <w:rFonts w:ascii="Times New Roman" w:hAnsi="Times New Roman" w:cs="Times New Roman"/>
+          <w:spacing w:val="-4"/>
+        </w:rPr>
+      </w:pPr>
+      <w:r>
+        <w:rPr>
+          <w:rFonts w:ascii="Times New Roman" w:hAnsi="Times New Roman" w:cs="Times New Roman"/>
+          <w:spacing w:val="-4"/>
+        </w:rPr>
+        <w:t>--privileged</w:t>
+      </w:r>
+      <w:r>
+        <w:rPr>
+          <w:rFonts w:ascii="Times New Roman" w:hAnsi="Times New Roman" w:cs="Times New Roman"/>
+          <w:spacing w:val="-22"/>
+        </w:rPr>
+        <w:t xml:space="preserve"> </w:t>
+      </w:r>
+      <w:r>
+        <w:rPr>
+          <w:rFonts w:ascii="Times New Roman" w:hAnsi="Times New Roman" w:cs="Times New Roman"/>
+          <w:spacing w:val="-4"/>
+        </w:rPr>
+        <w:t>rancher/</w:t>
+      </w:r>
+      <w:proofErr w:type="spellStart"/>
+      <w:proofErr w:type="gramStart"/>
+      <w:r>
+        <w:rPr>
+          <w:rFonts w:ascii="Times New Roman" w:hAnsi="Times New Roman" w:cs="Times New Roman"/>
+          <w:spacing w:val="-4"/>
+        </w:rPr>
+        <w:t>rancher:stable</w:t>
+      </w:r>
+      <w:proofErr w:type="spellEnd"/>
+      <w:proofErr w:type="gramEnd"/>
+    </w:p>
+    <w:p>
+      <w:pPr>
+        <w:pStyle w:val="BodyText"/>
+        <w:spacing w:before="48"/>
+        <w:ind w:left="1177"/>
+        <w:rPr>
+          <w:rFonts w:ascii="Times New Roman" w:hAnsi="Times New Roman" w:cs="Times New Roman"/>
+          <w:spacing w:val="-4"/>
+        </w:rPr>
+      </w:pPr>
+    </w:p>
+    <w:p>
+      <w:pPr>
+        <w:rPr>
+          <w:rFonts w:ascii="Times New Roman" w:hAnsi="Times New Roman" w:cs="Times New Roman"/>
+          <w:b/>
+          <w:bCs/>
+        </w:rPr>
+      </w:pPr>
+      <w:r>
+        <w:t xml:space="preserve">              </w:t>
+      </w:r>
+      <w:r>
+        <w:rPr>
+          <w:rFonts w:ascii="Times New Roman" w:hAnsi="Times New Roman" w:cs="Times New Roman"/>
+          <w:b/>
+          <w:bCs/>
+        </w:rPr>
+        <w:t xml:space="preserve"> Accessing Rancher UI:</w:t>
+      </w:r>
+    </w:p>
+    <w:p>
+      <w:pPr>
+        <w:rPr>
+          <w:rFonts w:ascii="Times New Roman" w:hAnsi="Times New Roman" w:cs="Times New Roman"/>
+          <w:b/>
+          <w:bCs/>
+        </w:rPr>
+      </w:pPr>
+      <w:r>
+        <w:rPr>
+          <w:rFonts w:ascii="Times New Roman" w:hAnsi="Times New Roman" w:cs="Times New Roman"/>
+          <w:b/>
+          <w:bCs/>
+        </w:rPr>
+        <w:t xml:space="preserve">                   </w:t>
+      </w:r>
+    </w:p>
+    <w:p>
+      <w:pPr>
+        <w:pStyle w:val="ListParagraph"/>
+        <w:tabs>
+          <w:tab w:val="left" w:pos="1799"/>
+        </w:tabs>
+        <w:spacing w:before="0"/>
+        <w:ind w:left="720" w:firstLine="0"/>
+        <w:rPr>
+          <w:rFonts w:ascii="Times New Roman" w:hAnsi="Times New Roman" w:cs="Times New Roman"/>
+          <w:spacing w:val="-3"/>
+          <w:sz w:val="24"/>
+        </w:rPr>
+      </w:pPr>
+      <w:r>
+        <w:rPr>
+          <w:rFonts w:ascii="Times New Roman" w:hAnsi="Times New Roman" w:cs="Times New Roman"/>
+          <w:w w:val="90"/>
+          <w:sz w:val="24"/>
+        </w:rPr>
+        <w:t xml:space="preserve">     </w:t>
+      </w:r>
+      <w:r>
+        <w:rPr>
+          <w:rFonts w:ascii="Times New Roman" w:hAnsi="Times New Roman" w:cs="Times New Roman"/>
+          <w:w w:val="90"/>
+          <w:sz w:val="24"/>
+        </w:rPr>
+        <w:t>Open</w:t>
+      </w:r>
+      <w:r>
+        <w:rPr>
+          <w:rFonts w:ascii="Times New Roman" w:hAnsi="Times New Roman" w:cs="Times New Roman"/>
+          <w:spacing w:val="-4"/>
+          <w:sz w:val="24"/>
+        </w:rPr>
+        <w:t xml:space="preserve"> </w:t>
+      </w:r>
+      <w:r>
+        <w:rPr>
+          <w:rFonts w:ascii="Times New Roman" w:hAnsi="Times New Roman" w:cs="Times New Roman"/>
+          <w:w w:val="90"/>
+          <w:sz w:val="24"/>
+        </w:rPr>
+        <w:t>browser</w:t>
+      </w:r>
+      <w:r>
+        <w:rPr>
+          <w:rFonts w:ascii="Times New Roman" w:hAnsi="Times New Roman" w:cs="Times New Roman"/>
+          <w:spacing w:val="-6"/>
+          <w:sz w:val="24"/>
+        </w:rPr>
+        <w:t xml:space="preserve"> </w:t>
+      </w:r>
+      <w:r>
+        <w:rPr>
+          <w:rFonts w:ascii="Times New Roman" w:hAnsi="Times New Roman" w:cs="Times New Roman"/>
+          <w:w w:val="90"/>
+          <w:sz w:val="24"/>
+        </w:rPr>
+        <w:t>→</w:t>
+      </w:r>
+      <w:r>
+        <w:rPr>
+          <w:rFonts w:ascii="Times New Roman" w:hAnsi="Times New Roman" w:cs="Times New Roman"/>
+          <w:spacing w:val="-4"/>
+          <w:sz w:val="24"/>
+        </w:rPr>
+        <w:t xml:space="preserve"> </w:t>
+      </w:r>
+      <w:r>
+        <w:rPr>
+          <w:rFonts w:ascii="Times New Roman" w:hAnsi="Times New Roman" w:cs="Times New Roman"/>
+          <w:w w:val="90"/>
+          <w:sz w:val="24"/>
+        </w:rPr>
+        <w:t>https://</w:t>
+      </w:r>
+      <w:r>
+        <w:rPr>
+          <w:rFonts w:ascii="Times New Roman" w:hAnsi="Times New Roman" w:cs="Times New Roman"/>
+          <w:spacing w:val="-3"/>
+          <w:sz w:val="24"/>
+        </w:rPr>
+        <w:t xml:space="preserve"> </w:t>
+      </w:r>
+      <w:r>
+        <w:rPr>
+          <w:rFonts w:ascii="Times New Roman" w:hAnsi="Times New Roman" w:cs="Times New Roman"/>
+          <w:spacing w:val="-3"/>
+          <w:sz w:val="24"/>
+        </w:rPr>
+        <w:t>54.235.212.191</w:t>
+      </w:r>
+    </w:p>
+    <w:p>
+      <w:pPr>
+        <w:pStyle w:val="ListParagraph"/>
+        <w:tabs>
+          <w:tab w:val="left" w:pos="1799"/>
+        </w:tabs>
+        <w:spacing w:before="0"/>
+        <w:ind w:left="720" w:firstLine="0"/>
+        <w:rPr>
+          <w:rFonts w:ascii="Times New Roman" w:hAnsi="Times New Roman" w:cs="Times New Roman"/>
+          <w:sz w:val="24"/>
+        </w:rPr>
+      </w:pPr>
+    </w:p>
+    <w:p>
+      <w:pPr>
+        <w:pStyle w:val="ListParagraph"/>
+        <w:tabs>
+          <w:tab w:val="left" w:pos="1799"/>
+        </w:tabs>
+        <w:spacing w:before="38"/>
+        <w:ind w:left="720" w:firstLine="0"/>
+        <w:rPr>
+          <w:rFonts w:ascii="Times New Roman" w:hAnsi="Times New Roman" w:cs="Times New Roman"/>
+          <w:spacing w:val="-6"/>
+          <w:sz w:val="24"/>
+        </w:rPr>
+      </w:pPr>
+      <w:r>
+        <w:rPr>
+          <w:rFonts w:ascii="Times New Roman" w:hAnsi="Times New Roman" w:cs="Times New Roman"/>
+          <w:spacing w:val="-6"/>
+          <w:sz w:val="24"/>
+        </w:rPr>
+        <w:t xml:space="preserve">    </w:t>
+      </w:r>
+      <w:r>
+        <w:rPr>
+          <w:rFonts w:ascii="Times New Roman" w:hAnsi="Times New Roman" w:cs="Times New Roman"/>
+          <w:spacing w:val="-6"/>
+          <w:sz w:val="24"/>
+        </w:rPr>
+        <w:t>Accept</w:t>
+      </w:r>
+      <w:r>
+        <w:rPr>
+          <w:rFonts w:ascii="Times New Roman" w:hAnsi="Times New Roman" w:cs="Times New Roman"/>
+          <w:spacing w:val="-26"/>
+          <w:sz w:val="24"/>
+        </w:rPr>
+        <w:t xml:space="preserve"> </w:t>
+      </w:r>
+      <w:r>
+        <w:rPr>
+          <w:rFonts w:ascii="Times New Roman" w:hAnsi="Times New Roman" w:cs="Times New Roman"/>
+          <w:spacing w:val="-6"/>
+          <w:sz w:val="24"/>
+        </w:rPr>
+        <w:t>SSL</w:t>
+      </w:r>
+      <w:r>
+        <w:rPr>
+          <w:rFonts w:ascii="Times New Roman" w:hAnsi="Times New Roman" w:cs="Times New Roman"/>
+          <w:spacing w:val="-22"/>
+          <w:sz w:val="24"/>
+        </w:rPr>
+        <w:t xml:space="preserve"> </w:t>
+      </w:r>
+      <w:r>
+        <w:rPr>
+          <w:rFonts w:ascii="Times New Roman" w:hAnsi="Times New Roman" w:cs="Times New Roman"/>
+          <w:spacing w:val="-6"/>
+          <w:sz w:val="24"/>
+        </w:rPr>
+        <w:t>warning</w:t>
+      </w:r>
+      <w:r>
+        <w:rPr>
+          <w:rFonts w:ascii="Times New Roman" w:hAnsi="Times New Roman" w:cs="Times New Roman"/>
+          <w:spacing w:val="-26"/>
+          <w:sz w:val="24"/>
+        </w:rPr>
+        <w:t xml:space="preserve"> </w:t>
+      </w:r>
+      <w:r>
+        <w:rPr>
+          <w:rFonts w:ascii="Times New Roman" w:hAnsi="Times New Roman" w:cs="Times New Roman"/>
+          <w:spacing w:val="-6"/>
+          <w:sz w:val="24"/>
+        </w:rPr>
+        <w:t>→</w:t>
+      </w:r>
+      <w:r>
+        <w:rPr>
+          <w:rFonts w:ascii="Times New Roman" w:hAnsi="Times New Roman" w:cs="Times New Roman"/>
+          <w:spacing w:val="-25"/>
+          <w:sz w:val="24"/>
+        </w:rPr>
+        <w:t xml:space="preserve"> </w:t>
+      </w:r>
+      <w:r>
+        <w:rPr>
+          <w:rFonts w:ascii="Times New Roman" w:hAnsi="Times New Roman" w:cs="Times New Roman"/>
+          <w:spacing w:val="-6"/>
+          <w:sz w:val="24"/>
+        </w:rPr>
+        <w:t>login</w:t>
+      </w:r>
+      <w:r>
+        <w:rPr>
+          <w:rFonts w:ascii="Times New Roman" w:hAnsi="Times New Roman" w:cs="Times New Roman"/>
+          <w:spacing w:val="-25"/>
+          <w:sz w:val="24"/>
+        </w:rPr>
+        <w:t xml:space="preserve"> </w:t>
+      </w:r>
+      <w:r>
+        <w:rPr>
+          <w:rFonts w:ascii="Times New Roman" w:hAnsi="Times New Roman" w:cs="Times New Roman"/>
+          <w:spacing w:val="-6"/>
+          <w:sz w:val="24"/>
+        </w:rPr>
+        <w:t>page</w:t>
+      </w:r>
+    </w:p>
+    <w:p>
+      <w:pPr>
+        <w:pStyle w:val="ListParagraph"/>
+        <w:tabs>
+          <w:tab w:val="left" w:pos="1799"/>
+        </w:tabs>
+        <w:spacing w:before="38"/>
+        <w:ind w:left="720" w:firstLine="0"/>
+        <w:rPr>
+          <w:rFonts w:ascii="Times New Roman" w:hAnsi="Times New Roman" w:cs="Times New Roman"/>
+          <w:sz w:val="24"/>
+        </w:rPr>
+      </w:pPr>
+    </w:p>
+    <w:p>
+      <w:pPr>
+        <w:pStyle w:val="ListParagraph"/>
+        <w:tabs>
+          <w:tab w:val="left" w:pos="1799"/>
+        </w:tabs>
+        <w:spacing w:before="41"/>
+        <w:ind w:left="720" w:firstLine="0"/>
+        <w:rPr>
+          <w:rFonts w:ascii="Times New Roman" w:hAnsi="Times New Roman" w:cs="Times New Roman"/>
+          <w:spacing w:val="-5"/>
+          <w:sz w:val="24"/>
+        </w:rPr>
+      </w:pPr>
+      <w:r>
+        <w:rPr>
+          <w:rFonts w:ascii="Times New Roman" w:hAnsi="Times New Roman" w:cs="Times New Roman"/>
+          <w:spacing w:val="-2"/>
+          <w:sz w:val="24"/>
+        </w:rPr>
+        <w:t xml:space="preserve">    </w:t>
+      </w:r>
+      <w:r>
+        <w:rPr>
+          <w:rFonts w:ascii="Times New Roman" w:hAnsi="Times New Roman" w:cs="Times New Roman"/>
+          <w:spacing w:val="-2"/>
+          <w:sz w:val="24"/>
+        </w:rPr>
+        <w:t>Run</w:t>
+      </w:r>
+      <w:r>
+        <w:rPr>
+          <w:rFonts w:ascii="Times New Roman" w:hAnsi="Times New Roman" w:cs="Times New Roman"/>
+          <w:spacing w:val="-25"/>
+          <w:sz w:val="24"/>
+        </w:rPr>
+        <w:t xml:space="preserve"> </w:t>
+      </w:r>
+      <w:r>
+        <w:rPr>
+          <w:rFonts w:ascii="Times New Roman" w:hAnsi="Times New Roman" w:cs="Times New Roman"/>
+          <w:spacing w:val="-2"/>
+          <w:sz w:val="24"/>
+        </w:rPr>
+        <w:t>the</w:t>
+      </w:r>
+      <w:r>
+        <w:rPr>
+          <w:rFonts w:ascii="Times New Roman" w:hAnsi="Times New Roman" w:cs="Times New Roman"/>
+          <w:spacing w:val="-21"/>
+          <w:sz w:val="24"/>
+        </w:rPr>
+        <w:t xml:space="preserve"> </w:t>
+      </w:r>
+      <w:r>
+        <w:rPr>
+          <w:rFonts w:ascii="Times New Roman" w:hAnsi="Times New Roman" w:cs="Times New Roman"/>
+          <w:spacing w:val="-2"/>
+          <w:sz w:val="24"/>
+        </w:rPr>
+        <w:t>password</w:t>
+      </w:r>
+      <w:r>
+        <w:rPr>
+          <w:rFonts w:ascii="Times New Roman" w:hAnsi="Times New Roman" w:cs="Times New Roman"/>
+          <w:spacing w:val="-21"/>
+          <w:sz w:val="24"/>
+        </w:rPr>
+        <w:t xml:space="preserve"> </w:t>
+      </w:r>
+      <w:r>
+        <w:rPr>
+          <w:rFonts w:ascii="Times New Roman" w:hAnsi="Times New Roman" w:cs="Times New Roman"/>
+          <w:spacing w:val="-2"/>
+          <w:sz w:val="24"/>
+        </w:rPr>
+        <w:t>retrieval</w:t>
+      </w:r>
+      <w:r>
+        <w:rPr>
+          <w:rFonts w:ascii="Times New Roman" w:hAnsi="Times New Roman" w:cs="Times New Roman"/>
+          <w:spacing w:val="-24"/>
+          <w:sz w:val="24"/>
+        </w:rPr>
+        <w:t xml:space="preserve"> </w:t>
+      </w:r>
+      <w:r>
+        <w:rPr>
+          <w:rFonts w:ascii="Times New Roman" w:hAnsi="Times New Roman" w:cs="Times New Roman"/>
+          <w:spacing w:val="-2"/>
+          <w:sz w:val="24"/>
+        </w:rPr>
+        <w:t>command</w:t>
+      </w:r>
+      <w:r>
+        <w:rPr>
+          <w:rFonts w:ascii="Times New Roman" w:hAnsi="Times New Roman" w:cs="Times New Roman"/>
+          <w:spacing w:val="-24"/>
+          <w:sz w:val="24"/>
+        </w:rPr>
+        <w:t xml:space="preserve"> </w:t>
+      </w:r>
+      <w:r>
+        <w:rPr>
+          <w:rFonts w:ascii="Times New Roman" w:hAnsi="Times New Roman" w:cs="Times New Roman"/>
+          <w:spacing w:val="-2"/>
+          <w:sz w:val="24"/>
+        </w:rPr>
+        <w:t>shown</w:t>
+      </w:r>
+      <w:r>
+        <w:rPr>
+          <w:rFonts w:ascii="Times New Roman" w:hAnsi="Times New Roman" w:cs="Times New Roman"/>
+          <w:spacing w:val="-19"/>
+          <w:sz w:val="24"/>
+        </w:rPr>
+        <w:t xml:space="preserve"> </w:t>
+      </w:r>
+      <w:r>
+        <w:rPr>
+          <w:rFonts w:ascii="Times New Roman" w:hAnsi="Times New Roman" w:cs="Times New Roman"/>
+          <w:spacing w:val="-2"/>
+          <w:sz w:val="24"/>
         </w:rPr>
         <w:t>in</w:t>
       </w:r>
       <w:r>
         <w:rPr>
           <w:rFonts w:ascii="Times New Roman" w:hAnsi="Times New Roman" w:cs="Times New Roman"/>
-          <w:spacing w:val="-25"/>
-        </w:rPr>
-        <w:t xml:space="preserve"> </w:t>
-      </w:r>
-      <w:r>
-        <w:rPr>
-          <w:rFonts w:ascii="Times New Roman" w:hAnsi="Times New Roman" w:cs="Times New Roman"/>
-        </w:rPr>
-        <w:t xml:space="preserve">ec2 </w:t>
+          <w:spacing w:val="-16"/>
+          <w:sz w:val="24"/>
+        </w:rPr>
+        <w:t xml:space="preserve"> </w:t>
+      </w:r>
+      <w:r>
+        <w:rPr>
+          <w:rFonts w:ascii="Times New Roman" w:hAnsi="Times New Roman" w:cs="Times New Roman"/>
+          <w:spacing w:val="-5"/>
+          <w:sz w:val="24"/>
+        </w:rPr>
+        <w:t>UI:</w:t>
+      </w:r>
+    </w:p>
+    <w:p>
+      <w:pPr>
+        <w:pStyle w:val="ListParagraph"/>
+        <w:tabs>
+          <w:tab w:val="left" w:pos="1799"/>
+        </w:tabs>
+        <w:spacing w:before="41"/>
+        <w:ind w:left="720" w:firstLine="0"/>
+        <w:rPr>
+          <w:rFonts w:ascii="Times New Roman" w:hAnsi="Times New Roman" w:cs="Times New Roman"/>
+          <w:spacing w:val="-5"/>
+          <w:sz w:val="24"/>
+        </w:rPr>
+      </w:pPr>
+    </w:p>
+    <w:p>
+      <w:pPr>
+        <w:rPr>
+          <w:rFonts w:ascii="Times New Roman" w:hAnsi="Times New Roman" w:cs="Times New Roman"/>
+        </w:rPr>
+      </w:pPr>
+      <w:r>
+        <w:t xml:space="preserve">             </w:t>
       </w:r>
       <w:proofErr w:type="spellStart"/>
       <w:r>
@@ -1933,84 +2579,35 @@
         <w:rPr>
           <w:rFonts w:ascii="Times New Roman" w:hAnsi="Times New Roman" w:cs="Times New Roman"/>
         </w:rPr>
-        <w:t xml:space="preserve"> apt-get update</w:t>
+        <w:t xml:space="preserve"> docker logs &lt;</w:t>
+      </w:r>
+      <w:proofErr w:type="spellStart"/>
+      <w:r>
+        <w:rPr>
+          <w:rFonts w:ascii="Times New Roman" w:hAnsi="Times New Roman" w:cs="Times New Roman"/>
+        </w:rPr>
+        <w:t>container_id</w:t>
+      </w:r>
+      <w:proofErr w:type="spellEnd"/>
+      <w:r>
+        <w:rPr>
+          <w:rFonts w:ascii="Times New Roman" w:hAnsi="Times New Roman" w:cs="Times New Roman"/>
+        </w:rPr>
+        <w:t>&gt; 2&gt;C1 | grep "Bootstrap Password" Use password → set your own admin password</w:t>
       </w:r>
     </w:p>
     <w:p>
       <w:pPr>
         <w:pStyle w:val="BodyText"/>
-        <w:spacing w:line="289" w:lineRule="exact"/>
-        <w:ind w:left="1080"/>
-        <w:rPr>
-          <w:rFonts w:ascii="Times New Roman" w:hAnsi="Times New Roman" w:cs="Times New Roman"/>
-        </w:rPr>
-      </w:pPr>
-      <w:proofErr w:type="spellStart"/>
-      <w:r>
-        <w:rPr>
-          <w:rFonts w:ascii="Times New Roman" w:hAnsi="Times New Roman" w:cs="Times New Roman"/>
-          <w:spacing w:val="-4"/>
-        </w:rPr>
-        <w:t>sudo</w:t>
-      </w:r>
-      <w:proofErr w:type="spellEnd"/>
-      <w:r>
-        <w:rPr>
-          <w:rFonts w:ascii="Times New Roman" w:hAnsi="Times New Roman" w:cs="Times New Roman"/>
-          <w:spacing w:val="-24"/>
-        </w:rPr>
-        <w:t xml:space="preserve"> </w:t>
-      </w:r>
-      <w:r>
-        <w:rPr>
-          <w:rFonts w:ascii="Times New Roman" w:hAnsi="Times New Roman" w:cs="Times New Roman"/>
-          <w:spacing w:val="-4"/>
-        </w:rPr>
-        <w:t>apt-get</w:t>
-      </w:r>
-      <w:r>
-        <w:rPr>
-          <w:rFonts w:ascii="Times New Roman" w:hAnsi="Times New Roman" w:cs="Times New Roman"/>
-          <w:spacing w:val="-21"/>
-        </w:rPr>
-        <w:t xml:space="preserve"> </w:t>
-      </w:r>
-      <w:r>
-        <w:rPr>
-          <w:rFonts w:ascii="Times New Roman" w:hAnsi="Times New Roman" w:cs="Times New Roman"/>
-          <w:spacing w:val="-4"/>
-        </w:rPr>
-        <w:t>upgrade</w:t>
-      </w:r>
-      <w:r>
-        <w:rPr>
-          <w:rFonts w:ascii="Times New Roman" w:hAnsi="Times New Roman" w:cs="Times New Roman"/>
-          <w:spacing w:val="-23"/>
-        </w:rPr>
-        <w:t xml:space="preserve"> </w:t>
-      </w:r>
-      <w:r>
-        <w:rPr>
-          <w:rFonts w:ascii="Times New Roman" w:hAnsi="Times New Roman" w:cs="Times New Roman"/>
-          <w:spacing w:val="-4"/>
-        </w:rPr>
-        <w:t>-</w:t>
-      </w:r>
-      <w:r>
-        <w:rPr>
-          <w:rFonts w:ascii="Times New Roman" w:hAnsi="Times New Roman" w:cs="Times New Roman"/>
-          <w:spacing w:val="-10"/>
-        </w:rPr>
-        <w:t>y</w:t>
-      </w:r>
-    </w:p>
-    <w:p>
-      <w:pPr>
-        <w:pStyle w:val="BodyText"/>
-        <w:spacing w:line="289" w:lineRule="exact"/>
-        <w:rPr>
-          <w:rFonts w:ascii="Times New Roman" w:hAnsi="Times New Roman" w:cs="Times New Roman"/>
-        </w:rPr>
+        <w:spacing w:before="38" w:line="412" w:lineRule="auto"/>
+        <w:ind w:right="401"/>
+        <w:rPr>
+          <w:rFonts w:ascii="Times New Roman" w:hAnsi="Times New Roman" w:cs="Times New Roman"/>
+        </w:rPr>
+      </w:pPr>
+    </w:p>
+    <w:p>
+      <w:pPr>
         <w:sectPr>
           <w:pgSz w:w="12240" w:h="15840"/>
           <w:pgMar w:top="1440" w:right="1080" w:bottom="280" w:left="1080" w:header="720" w:footer="720" w:gutter="0"/>
@@ -2020,1135 +2617,22 @@
     </w:p>
     <w:p>
       <w:pPr>
-        <w:pStyle w:val="BodyText"/>
-        <w:spacing w:before="65" w:line="280" w:lineRule="auto"/>
-        <w:ind w:left="1080" w:right="5393"/>
-        <w:rPr>
-          <w:rFonts w:ascii="Times New Roman" w:hAnsi="Times New Roman" w:cs="Times New Roman"/>
-        </w:rPr>
-      </w:pPr>
-      <w:proofErr w:type="spellStart"/>
-      <w:r>
-        <w:rPr>
-          <w:rFonts w:ascii="Times New Roman" w:hAnsi="Times New Roman" w:cs="Times New Roman"/>
-          <w:spacing w:val="-2"/>
-        </w:rPr>
-        <w:lastRenderedPageBreak/>
-        <w:t>sudo</w:t>
-      </w:r>
-      <w:proofErr w:type="spellEnd"/>
-      <w:r>
-        <w:rPr>
-          <w:rFonts w:ascii="Times New Roman" w:hAnsi="Times New Roman" w:cs="Times New Roman"/>
-          <w:spacing w:val="-27"/>
-        </w:rPr>
-        <w:t xml:space="preserve"> </w:t>
-      </w:r>
-      <w:r>
-        <w:rPr>
-          <w:rFonts w:ascii="Times New Roman" w:hAnsi="Times New Roman" w:cs="Times New Roman"/>
-          <w:spacing w:val="-2"/>
-        </w:rPr>
-        <w:t>apt-get</w:t>
-      </w:r>
-      <w:r>
-        <w:rPr>
-          <w:rFonts w:ascii="Times New Roman" w:hAnsi="Times New Roman" w:cs="Times New Roman"/>
-          <w:spacing w:val="-25"/>
-        </w:rPr>
-        <w:t xml:space="preserve"> </w:t>
-      </w:r>
-      <w:r>
-        <w:rPr>
-          <w:rFonts w:ascii="Times New Roman" w:hAnsi="Times New Roman" w:cs="Times New Roman"/>
-          <w:spacing w:val="-2"/>
-        </w:rPr>
-        <w:t>install</w:t>
-      </w:r>
-      <w:r>
-        <w:rPr>
-          <w:rFonts w:ascii="Times New Roman" w:hAnsi="Times New Roman" w:cs="Times New Roman"/>
-          <w:spacing w:val="-27"/>
-        </w:rPr>
-        <w:t xml:space="preserve"> </w:t>
-      </w:r>
-      <w:r>
-        <w:rPr>
-          <w:rFonts w:ascii="Times New Roman" w:hAnsi="Times New Roman" w:cs="Times New Roman"/>
-          <w:spacing w:val="-2"/>
-        </w:rPr>
-        <w:t>docker.io</w:t>
-      </w:r>
-      <w:r>
-        <w:rPr>
-          <w:rFonts w:ascii="Times New Roman" w:hAnsi="Times New Roman" w:cs="Times New Roman"/>
-          <w:spacing w:val="-30"/>
-        </w:rPr>
-        <w:t xml:space="preserve"> </w:t>
-      </w:r>
-      <w:r>
-        <w:rPr>
-          <w:rFonts w:ascii="Times New Roman" w:hAnsi="Times New Roman" w:cs="Times New Roman"/>
-          <w:spacing w:val="-2"/>
-        </w:rPr>
-        <w:t xml:space="preserve">-y </w:t>
-      </w:r>
-      <w:proofErr w:type="spellStart"/>
-      <w:r>
-        <w:rPr>
-          <w:rFonts w:ascii="Times New Roman" w:hAnsi="Times New Roman" w:cs="Times New Roman"/>
-        </w:rPr>
-        <w:t>sudo</w:t>
-      </w:r>
-      <w:proofErr w:type="spellEnd"/>
-      <w:r>
-        <w:rPr>
-          <w:rFonts w:ascii="Times New Roman" w:hAnsi="Times New Roman" w:cs="Times New Roman"/>
-        </w:rPr>
-        <w:t xml:space="preserve"> </w:t>
-      </w:r>
-      <w:proofErr w:type="spellStart"/>
-      <w:r>
-        <w:rPr>
-          <w:rFonts w:ascii="Times New Roman" w:hAnsi="Times New Roman" w:cs="Times New Roman"/>
-        </w:rPr>
-        <w:t>systemctl</w:t>
-      </w:r>
-      <w:proofErr w:type="spellEnd"/>
-      <w:r>
-        <w:rPr>
-          <w:rFonts w:ascii="Times New Roman" w:hAnsi="Times New Roman" w:cs="Times New Roman"/>
-        </w:rPr>
-        <w:t xml:space="preserve"> enable docker </w:t>
-      </w:r>
-      <w:proofErr w:type="spellStart"/>
-      <w:r>
-        <w:rPr>
-          <w:rFonts w:ascii="Times New Roman" w:hAnsi="Times New Roman" w:cs="Times New Roman"/>
-        </w:rPr>
-        <w:t>sudo</w:t>
-      </w:r>
-      <w:proofErr w:type="spellEnd"/>
-      <w:r>
-        <w:rPr>
-          <w:rFonts w:ascii="Times New Roman" w:hAnsi="Times New Roman" w:cs="Times New Roman"/>
-        </w:rPr>
-        <w:t xml:space="preserve"> </w:t>
-      </w:r>
-      <w:proofErr w:type="spellStart"/>
-      <w:r>
-        <w:rPr>
-          <w:rFonts w:ascii="Times New Roman" w:hAnsi="Times New Roman" w:cs="Times New Roman"/>
-        </w:rPr>
-        <w:t>systemctl</w:t>
-      </w:r>
-      <w:proofErr w:type="spellEnd"/>
-      <w:r>
-        <w:rPr>
-          <w:rFonts w:ascii="Times New Roman" w:hAnsi="Times New Roman" w:cs="Times New Roman"/>
-        </w:rPr>
-        <w:t xml:space="preserve"> start docker</w:t>
-      </w:r>
-    </w:p>
-    <w:p>
-      <w:pPr>
-        <w:pStyle w:val="BodyText"/>
-        <w:spacing w:before="52"/>
-        <w:rPr>
-          <w:rFonts w:ascii="Times New Roman" w:hAnsi="Times New Roman" w:cs="Times New Roman"/>
-        </w:rPr>
-      </w:pPr>
-    </w:p>
-    <w:p>
-      <w:pPr>
         <w:pStyle w:val="Heading1"/>
-        <w:ind w:left="1080"/>
-        <w:rPr>
-          <w:rFonts w:ascii="Times New Roman" w:hAnsi="Times New Roman" w:cs="Times New Roman"/>
-        </w:rPr>
-      </w:pPr>
-      <w:r>
-        <w:rPr>
-          <w:rFonts w:ascii="Times New Roman" w:hAnsi="Times New Roman" w:cs="Times New Roman"/>
-          <w:w w:val="90"/>
-        </w:rPr>
-        <w:t>Run</w:t>
-      </w:r>
-      <w:r>
-        <w:rPr>
-          <w:rFonts w:ascii="Times New Roman" w:hAnsi="Times New Roman" w:cs="Times New Roman"/>
-          <w:spacing w:val="-13"/>
-          <w:w w:val="90"/>
-        </w:rPr>
-        <w:t xml:space="preserve"> </w:t>
-      </w:r>
-      <w:r>
-        <w:rPr>
-          <w:rFonts w:ascii="Times New Roman" w:hAnsi="Times New Roman" w:cs="Times New Roman"/>
-          <w:w w:val="90"/>
-        </w:rPr>
-        <w:t>Rancher</w:t>
-      </w:r>
-      <w:r>
-        <w:rPr>
-          <w:rFonts w:ascii="Times New Roman" w:hAnsi="Times New Roman" w:cs="Times New Roman"/>
-          <w:spacing w:val="-13"/>
-          <w:w w:val="90"/>
-        </w:rPr>
-        <w:t xml:space="preserve"> </w:t>
-      </w:r>
-      <w:r>
-        <w:rPr>
-          <w:rFonts w:ascii="Times New Roman" w:hAnsi="Times New Roman" w:cs="Times New Roman"/>
-          <w:w w:val="90"/>
-        </w:rPr>
-        <w:t>in</w:t>
-      </w:r>
-      <w:r>
-        <w:rPr>
-          <w:rFonts w:ascii="Times New Roman" w:hAnsi="Times New Roman" w:cs="Times New Roman"/>
-          <w:spacing w:val="-13"/>
-          <w:w w:val="90"/>
-        </w:rPr>
-        <w:t xml:space="preserve"> </w:t>
-      </w:r>
-      <w:r>
-        <w:rPr>
-          <w:rFonts w:ascii="Times New Roman" w:hAnsi="Times New Roman" w:cs="Times New Roman"/>
-          <w:spacing w:val="-2"/>
-          <w:w w:val="90"/>
-        </w:rPr>
-        <w:t>Docker</w:t>
-      </w:r>
-    </w:p>
-    <w:p>
-      <w:pPr>
-        <w:pStyle w:val="BodyText"/>
-        <w:spacing w:before="97"/>
-        <w:rPr>
-          <w:rFonts w:ascii="Times New Roman" w:hAnsi="Times New Roman" w:cs="Times New Roman"/>
-          <w:b/>
-        </w:rPr>
-      </w:pPr>
-    </w:p>
-    <w:p>
-      <w:pPr>
-        <w:pStyle w:val="BodyText"/>
-        <w:spacing w:before="1"/>
-        <w:ind w:left="1177"/>
-        <w:rPr>
-          <w:rFonts w:ascii="Times New Roman" w:hAnsi="Times New Roman" w:cs="Times New Roman"/>
-        </w:rPr>
-      </w:pPr>
-      <w:proofErr w:type="spellStart"/>
-      <w:r>
-        <w:rPr>
-          <w:rFonts w:ascii="Times New Roman" w:hAnsi="Times New Roman" w:cs="Times New Roman"/>
-          <w:spacing w:val="-2"/>
-        </w:rPr>
-        <w:t>sudo</w:t>
-      </w:r>
-      <w:proofErr w:type="spellEnd"/>
-      <w:r>
-        <w:rPr>
-          <w:rFonts w:ascii="Times New Roman" w:hAnsi="Times New Roman" w:cs="Times New Roman"/>
-          <w:spacing w:val="-29"/>
-        </w:rPr>
-        <w:t xml:space="preserve"> </w:t>
-      </w:r>
-      <w:r>
-        <w:rPr>
-          <w:rFonts w:ascii="Times New Roman" w:hAnsi="Times New Roman" w:cs="Times New Roman"/>
-          <w:spacing w:val="-2"/>
-        </w:rPr>
-        <w:t>docker</w:t>
-      </w:r>
-      <w:r>
-        <w:rPr>
-          <w:rFonts w:ascii="Times New Roman" w:hAnsi="Times New Roman" w:cs="Times New Roman"/>
-          <w:spacing w:val="-23"/>
-        </w:rPr>
-        <w:t xml:space="preserve"> </w:t>
-      </w:r>
-      <w:r>
-        <w:rPr>
-          <w:rFonts w:ascii="Times New Roman" w:hAnsi="Times New Roman" w:cs="Times New Roman"/>
-          <w:spacing w:val="-2"/>
-        </w:rPr>
-        <w:t>run</w:t>
-      </w:r>
-      <w:r>
-        <w:rPr>
-          <w:rFonts w:ascii="Times New Roman" w:hAnsi="Times New Roman" w:cs="Times New Roman"/>
-          <w:spacing w:val="-26"/>
-        </w:rPr>
-        <w:t xml:space="preserve"> </w:t>
-      </w:r>
-      <w:r>
-        <w:rPr>
-          <w:rFonts w:ascii="Times New Roman" w:hAnsi="Times New Roman" w:cs="Times New Roman"/>
-          <w:spacing w:val="-2"/>
-        </w:rPr>
-        <w:t>-d</w:t>
-      </w:r>
-      <w:r>
-        <w:rPr>
-          <w:rFonts w:ascii="Times New Roman" w:hAnsi="Times New Roman" w:cs="Times New Roman"/>
-          <w:spacing w:val="-25"/>
-        </w:rPr>
-        <w:t xml:space="preserve"> </w:t>
-      </w:r>
-      <w:r>
-        <w:rPr>
-          <w:rFonts w:ascii="Times New Roman" w:hAnsi="Times New Roman" w:cs="Times New Roman"/>
-          <w:spacing w:val="-2"/>
-        </w:rPr>
-        <w:t>--restart=unless-stopped</w:t>
-      </w:r>
-      <w:r>
-        <w:rPr>
-          <w:rFonts w:ascii="Times New Roman" w:hAnsi="Times New Roman" w:cs="Times New Roman"/>
-          <w:spacing w:val="-26"/>
-        </w:rPr>
-        <w:t xml:space="preserve"> </w:t>
-      </w:r>
-      <w:r>
-        <w:rPr>
-          <w:rFonts w:ascii="Times New Roman" w:hAnsi="Times New Roman" w:cs="Times New Roman"/>
-          <w:spacing w:val="-10"/>
-        </w:rPr>
-        <w:t>\</w:t>
-      </w:r>
-    </w:p>
-    <w:p>
-      <w:pPr>
-        <w:pStyle w:val="BodyText"/>
-        <w:spacing w:before="51"/>
-        <w:ind w:left="1177"/>
-        <w:rPr>
-          <w:rFonts w:ascii="Times New Roman" w:hAnsi="Times New Roman" w:cs="Times New Roman"/>
-        </w:rPr>
-      </w:pPr>
-      <w:r>
-        <w:rPr>
-          <w:rFonts w:ascii="Times New Roman" w:hAnsi="Times New Roman" w:cs="Times New Roman"/>
-          <w:spacing w:val="-6"/>
-        </w:rPr>
-        <w:t>-p</w:t>
-      </w:r>
-      <w:r>
-        <w:rPr>
-          <w:rFonts w:ascii="Times New Roman" w:hAnsi="Times New Roman" w:cs="Times New Roman"/>
-          <w:spacing w:val="-22"/>
-        </w:rPr>
-        <w:t xml:space="preserve"> </w:t>
-      </w:r>
-      <w:r>
-        <w:rPr>
-          <w:rFonts w:ascii="Times New Roman" w:hAnsi="Times New Roman" w:cs="Times New Roman"/>
-          <w:spacing w:val="-6"/>
-        </w:rPr>
-        <w:t>80:80</w:t>
-      </w:r>
-      <w:r>
-        <w:rPr>
-          <w:rFonts w:ascii="Times New Roman" w:hAnsi="Times New Roman" w:cs="Times New Roman"/>
-          <w:spacing w:val="-23"/>
-        </w:rPr>
-        <w:t xml:space="preserve"> </w:t>
-      </w:r>
-      <w:r>
-        <w:rPr>
-          <w:rFonts w:ascii="Times New Roman" w:hAnsi="Times New Roman" w:cs="Times New Roman"/>
-          <w:spacing w:val="-6"/>
-        </w:rPr>
-        <w:t>-p</w:t>
-      </w:r>
-      <w:r>
-        <w:rPr>
-          <w:rFonts w:ascii="Times New Roman" w:hAnsi="Times New Roman" w:cs="Times New Roman"/>
-          <w:spacing w:val="-24"/>
-        </w:rPr>
-        <w:t xml:space="preserve"> </w:t>
-      </w:r>
-      <w:r>
-        <w:rPr>
-          <w:rFonts w:ascii="Times New Roman" w:hAnsi="Times New Roman" w:cs="Times New Roman"/>
-          <w:spacing w:val="-6"/>
-        </w:rPr>
-        <w:t>443:443</w:t>
-      </w:r>
-      <w:r>
-        <w:rPr>
-          <w:rFonts w:ascii="Times New Roman" w:hAnsi="Times New Roman" w:cs="Times New Roman"/>
-          <w:spacing w:val="-25"/>
-        </w:rPr>
-        <w:t xml:space="preserve"> </w:t>
-      </w:r>
-      <w:r>
-        <w:rPr>
-          <w:rFonts w:ascii="Times New Roman" w:hAnsi="Times New Roman" w:cs="Times New Roman"/>
-          <w:spacing w:val="-10"/>
-        </w:rPr>
-        <w:t>\</w:t>
-      </w:r>
-    </w:p>
-    <w:p>
-      <w:pPr>
-        <w:pStyle w:val="BodyText"/>
-        <w:spacing w:before="48"/>
-        <w:ind w:left="1177"/>
-        <w:rPr>
-          <w:rFonts w:ascii="Times New Roman" w:hAnsi="Times New Roman" w:cs="Times New Roman"/>
-        </w:rPr>
-      </w:pPr>
-      <w:r>
-        <w:rPr>
-          <w:rFonts w:ascii="Times New Roman" w:hAnsi="Times New Roman" w:cs="Times New Roman"/>
-          <w:spacing w:val="-4"/>
-        </w:rPr>
-        <w:t>--privileged</w:t>
-      </w:r>
-      <w:r>
-        <w:rPr>
-          <w:rFonts w:ascii="Times New Roman" w:hAnsi="Times New Roman" w:cs="Times New Roman"/>
-          <w:spacing w:val="-22"/>
-        </w:rPr>
-        <w:t xml:space="preserve"> </w:t>
-      </w:r>
-      <w:r>
-        <w:rPr>
-          <w:rFonts w:ascii="Times New Roman" w:hAnsi="Times New Roman" w:cs="Times New Roman"/>
-          <w:spacing w:val="-4"/>
-        </w:rPr>
-        <w:t>rancher/</w:t>
-      </w:r>
-      <w:proofErr w:type="spellStart"/>
-      <w:proofErr w:type="gramStart"/>
-      <w:r>
-        <w:rPr>
-          <w:rFonts w:ascii="Times New Roman" w:hAnsi="Times New Roman" w:cs="Times New Roman"/>
-          <w:spacing w:val="-4"/>
-        </w:rPr>
-        <w:t>rancher:stable</w:t>
-      </w:r>
-      <w:proofErr w:type="spellEnd"/>
-      <w:proofErr w:type="gramEnd"/>
-    </w:p>
-    <w:p>
-      <w:pPr>
-        <w:pStyle w:val="BodyText"/>
-        <w:spacing w:before="100"/>
-        <w:rPr>
-          <w:rFonts w:ascii="Times New Roman" w:hAnsi="Times New Roman" w:cs="Times New Roman"/>
-        </w:rPr>
-      </w:pPr>
-    </w:p>
-    <w:p>
-      <w:pPr>
-        <w:pStyle w:val="Heading1"/>
-        <w:ind w:left="1080"/>
-        <w:rPr>
-          <w:rFonts w:ascii="Times New Roman" w:hAnsi="Times New Roman" w:cs="Times New Roman"/>
-        </w:rPr>
-      </w:pPr>
-      <w:r>
-        <w:rPr>
-          <w:rFonts w:ascii="Times New Roman" w:hAnsi="Times New Roman" w:cs="Times New Roman"/>
-          <w:w w:val="90"/>
-        </w:rPr>
-        <w:t>Access</w:t>
-      </w:r>
-      <w:r>
-        <w:rPr>
-          <w:rFonts w:ascii="Times New Roman" w:hAnsi="Times New Roman" w:cs="Times New Roman"/>
-          <w:spacing w:val="15"/>
-        </w:rPr>
-        <w:t xml:space="preserve"> </w:t>
-      </w:r>
-      <w:r>
-        <w:rPr>
-          <w:rFonts w:ascii="Times New Roman" w:hAnsi="Times New Roman" w:cs="Times New Roman"/>
-          <w:w w:val="90"/>
-        </w:rPr>
-        <w:t>Rancher</w:t>
-      </w:r>
-      <w:r>
-        <w:rPr>
-          <w:rFonts w:ascii="Times New Roman" w:hAnsi="Times New Roman" w:cs="Times New Roman"/>
-          <w:spacing w:val="10"/>
-        </w:rPr>
-        <w:t xml:space="preserve"> </w:t>
-      </w:r>
-      <w:r>
-        <w:rPr>
-          <w:rFonts w:ascii="Times New Roman" w:hAnsi="Times New Roman" w:cs="Times New Roman"/>
-          <w:spacing w:val="-5"/>
-          <w:w w:val="90"/>
-        </w:rPr>
-        <w:t>UI</w:t>
-      </w:r>
-    </w:p>
-    <w:p>
-      <w:pPr>
-        <w:pStyle w:val="BodyText"/>
-        <w:spacing w:before="100"/>
-        <w:rPr>
-          <w:rFonts w:ascii="Times New Roman" w:hAnsi="Times New Roman" w:cs="Times New Roman"/>
-          <w:b/>
-        </w:rPr>
-      </w:pPr>
-    </w:p>
-    <w:p>
-      <w:pPr>
-        <w:pStyle w:val="ListParagraph"/>
-        <w:numPr>
-          <w:ilvl w:val="0"/>
-          <w:numId w:val="5"/>
-        </w:numPr>
-        <w:tabs>
-          <w:tab w:val="left" w:pos="1799"/>
-        </w:tabs>
-        <w:spacing w:before="0"/>
-        <w:ind w:left="1799" w:hanging="359"/>
-        <w:rPr>
-          <w:rFonts w:ascii="Times New Roman" w:hAnsi="Times New Roman" w:cs="Times New Roman"/>
-          <w:sz w:val="24"/>
-        </w:rPr>
-      </w:pPr>
-      <w:r>
-        <w:rPr>
-          <w:rFonts w:ascii="Times New Roman" w:hAnsi="Times New Roman" w:cs="Times New Roman"/>
-          <w:w w:val="90"/>
-          <w:sz w:val="24"/>
-        </w:rPr>
-        <w:t>Open</w:t>
-      </w:r>
-      <w:r>
-        <w:rPr>
-          <w:rFonts w:ascii="Times New Roman" w:hAnsi="Times New Roman" w:cs="Times New Roman"/>
-          <w:spacing w:val="-4"/>
-          <w:sz w:val="24"/>
-        </w:rPr>
-        <w:t xml:space="preserve"> </w:t>
-      </w:r>
-      <w:r>
-        <w:rPr>
-          <w:rFonts w:ascii="Times New Roman" w:hAnsi="Times New Roman" w:cs="Times New Roman"/>
-          <w:w w:val="90"/>
-          <w:sz w:val="24"/>
-        </w:rPr>
-        <w:t>browser</w:t>
-      </w:r>
-      <w:r>
-        <w:rPr>
-          <w:rFonts w:ascii="Times New Roman" w:hAnsi="Times New Roman" w:cs="Times New Roman"/>
-          <w:spacing w:val="-6"/>
-          <w:sz w:val="24"/>
-        </w:rPr>
-        <w:t xml:space="preserve"> </w:t>
-      </w:r>
-      <w:r>
-        <w:rPr>
-          <w:rFonts w:ascii="Times New Roman" w:hAnsi="Times New Roman" w:cs="Times New Roman"/>
-          <w:w w:val="90"/>
-          <w:sz w:val="24"/>
-        </w:rPr>
-        <w:t>→</w:t>
-      </w:r>
-      <w:r>
-        <w:rPr>
-          <w:rFonts w:ascii="Times New Roman" w:hAnsi="Times New Roman" w:cs="Times New Roman"/>
-          <w:spacing w:val="-4"/>
-          <w:sz w:val="24"/>
-        </w:rPr>
-        <w:t xml:space="preserve"> </w:t>
-      </w:r>
-      <w:r>
-        <w:rPr>
-          <w:rFonts w:ascii="Times New Roman" w:hAnsi="Times New Roman" w:cs="Times New Roman"/>
-          <w:w w:val="90"/>
-          <w:sz w:val="24"/>
-        </w:rPr>
-        <w:t>https://</w:t>
-      </w:r>
-      <w:r>
-        <w:rPr>
-          <w:rFonts w:ascii="Times New Roman" w:hAnsi="Times New Roman" w:cs="Times New Roman"/>
-          <w:spacing w:val="-3"/>
-          <w:sz w:val="24"/>
-        </w:rPr>
-        <w:t xml:space="preserve"> </w:t>
-      </w:r>
-      <w:r>
-        <w:rPr>
-          <w:rFonts w:ascii="Times New Roman" w:hAnsi="Times New Roman" w:cs="Times New Roman"/>
-          <w:spacing w:val="-2"/>
-          <w:w w:val="90"/>
-          <w:sz w:val="24"/>
-        </w:rPr>
-        <w:t>98.89.70.148</w:t>
-      </w:r>
-    </w:p>
-    <w:p>
-      <w:pPr>
-        <w:pStyle w:val="ListParagraph"/>
-        <w:numPr>
-          <w:ilvl w:val="0"/>
-          <w:numId w:val="5"/>
-        </w:numPr>
-        <w:tabs>
-          <w:tab w:val="left" w:pos="1799"/>
-        </w:tabs>
-        <w:spacing w:before="38"/>
-        <w:ind w:left="1799" w:hanging="359"/>
-        <w:rPr>
-          <w:rFonts w:ascii="Times New Roman" w:hAnsi="Times New Roman" w:cs="Times New Roman"/>
-          <w:sz w:val="24"/>
-        </w:rPr>
-      </w:pPr>
-      <w:r>
-        <w:rPr>
-          <w:rFonts w:ascii="Times New Roman" w:hAnsi="Times New Roman" w:cs="Times New Roman"/>
-          <w:spacing w:val="-6"/>
-          <w:sz w:val="24"/>
-        </w:rPr>
-        <w:t>Accept</w:t>
-      </w:r>
-      <w:r>
-        <w:rPr>
-          <w:rFonts w:ascii="Times New Roman" w:hAnsi="Times New Roman" w:cs="Times New Roman"/>
-          <w:spacing w:val="-26"/>
-          <w:sz w:val="24"/>
-        </w:rPr>
-        <w:t xml:space="preserve"> </w:t>
-      </w:r>
-      <w:r>
-        <w:rPr>
-          <w:rFonts w:ascii="Times New Roman" w:hAnsi="Times New Roman" w:cs="Times New Roman"/>
-          <w:spacing w:val="-6"/>
-          <w:sz w:val="24"/>
-        </w:rPr>
-        <w:t>SSL</w:t>
-      </w:r>
-      <w:r>
-        <w:rPr>
-          <w:rFonts w:ascii="Times New Roman" w:hAnsi="Times New Roman" w:cs="Times New Roman"/>
-          <w:spacing w:val="-22"/>
-          <w:sz w:val="24"/>
-        </w:rPr>
-        <w:t xml:space="preserve"> </w:t>
-      </w:r>
-      <w:r>
-        <w:rPr>
-          <w:rFonts w:ascii="Times New Roman" w:hAnsi="Times New Roman" w:cs="Times New Roman"/>
-          <w:spacing w:val="-6"/>
-          <w:sz w:val="24"/>
-        </w:rPr>
-        <w:t>warning</w:t>
-      </w:r>
-      <w:r>
-        <w:rPr>
-          <w:rFonts w:ascii="Times New Roman" w:hAnsi="Times New Roman" w:cs="Times New Roman"/>
-          <w:spacing w:val="-26"/>
-          <w:sz w:val="24"/>
-        </w:rPr>
-        <w:t xml:space="preserve"> </w:t>
-      </w:r>
-      <w:r>
-        <w:rPr>
-          <w:rFonts w:ascii="Times New Roman" w:hAnsi="Times New Roman" w:cs="Times New Roman"/>
-          <w:spacing w:val="-6"/>
-          <w:sz w:val="24"/>
-        </w:rPr>
-        <w:t>→</w:t>
-      </w:r>
-      <w:r>
-        <w:rPr>
-          <w:rFonts w:ascii="Times New Roman" w:hAnsi="Times New Roman" w:cs="Times New Roman"/>
-          <w:spacing w:val="-25"/>
-          <w:sz w:val="24"/>
-        </w:rPr>
-        <w:t xml:space="preserve"> </w:t>
-      </w:r>
-      <w:r>
-        <w:rPr>
-          <w:rFonts w:ascii="Times New Roman" w:hAnsi="Times New Roman" w:cs="Times New Roman"/>
-          <w:spacing w:val="-6"/>
-          <w:sz w:val="24"/>
-        </w:rPr>
-        <w:t>login</w:t>
-      </w:r>
-      <w:r>
-        <w:rPr>
-          <w:rFonts w:ascii="Times New Roman" w:hAnsi="Times New Roman" w:cs="Times New Roman"/>
-          <w:spacing w:val="-25"/>
-          <w:sz w:val="24"/>
-        </w:rPr>
-        <w:t xml:space="preserve"> </w:t>
-      </w:r>
-      <w:r>
-        <w:rPr>
-          <w:rFonts w:ascii="Times New Roman" w:hAnsi="Times New Roman" w:cs="Times New Roman"/>
-          <w:spacing w:val="-6"/>
-          <w:sz w:val="24"/>
-        </w:rPr>
-        <w:t>page</w:t>
-      </w:r>
-    </w:p>
-    <w:p>
-      <w:pPr>
-        <w:pStyle w:val="ListParagraph"/>
-        <w:numPr>
-          <w:ilvl w:val="0"/>
-          <w:numId w:val="5"/>
-        </w:numPr>
-        <w:tabs>
-          <w:tab w:val="left" w:pos="1799"/>
-        </w:tabs>
-        <w:spacing w:before="41"/>
-        <w:ind w:left="1799" w:hanging="359"/>
-        <w:rPr>
-          <w:rFonts w:ascii="Times New Roman" w:hAnsi="Times New Roman" w:cs="Times New Roman"/>
-          <w:sz w:val="24"/>
-        </w:rPr>
-      </w:pPr>
-      <w:r>
-        <w:rPr>
-          <w:rFonts w:ascii="Times New Roman" w:hAnsi="Times New Roman" w:cs="Times New Roman"/>
-          <w:spacing w:val="-2"/>
-          <w:sz w:val="24"/>
-        </w:rPr>
-        <w:t>Run</w:t>
-      </w:r>
-      <w:r>
-        <w:rPr>
-          <w:rFonts w:ascii="Times New Roman" w:hAnsi="Times New Roman" w:cs="Times New Roman"/>
-          <w:spacing w:val="-25"/>
-          <w:sz w:val="24"/>
-        </w:rPr>
-        <w:t xml:space="preserve"> </w:t>
-      </w:r>
-      <w:r>
-        <w:rPr>
-          <w:rFonts w:ascii="Times New Roman" w:hAnsi="Times New Roman" w:cs="Times New Roman"/>
-          <w:spacing w:val="-2"/>
-          <w:sz w:val="24"/>
-        </w:rPr>
-        <w:t>the</w:t>
-      </w:r>
-      <w:r>
-        <w:rPr>
-          <w:rFonts w:ascii="Times New Roman" w:hAnsi="Times New Roman" w:cs="Times New Roman"/>
-          <w:spacing w:val="-21"/>
-          <w:sz w:val="24"/>
-        </w:rPr>
-        <w:t xml:space="preserve"> </w:t>
-      </w:r>
-      <w:r>
-        <w:rPr>
-          <w:rFonts w:ascii="Times New Roman" w:hAnsi="Times New Roman" w:cs="Times New Roman"/>
-          <w:spacing w:val="-2"/>
-          <w:sz w:val="24"/>
-        </w:rPr>
-        <w:t>password</w:t>
-      </w:r>
-      <w:r>
-        <w:rPr>
-          <w:rFonts w:ascii="Times New Roman" w:hAnsi="Times New Roman" w:cs="Times New Roman"/>
-          <w:spacing w:val="-21"/>
-          <w:sz w:val="24"/>
-        </w:rPr>
-        <w:t xml:space="preserve"> </w:t>
-      </w:r>
-      <w:r>
-        <w:rPr>
-          <w:rFonts w:ascii="Times New Roman" w:hAnsi="Times New Roman" w:cs="Times New Roman"/>
-          <w:spacing w:val="-2"/>
-          <w:sz w:val="24"/>
-        </w:rPr>
-        <w:t>retrieval</w:t>
-      </w:r>
-      <w:r>
-        <w:rPr>
-          <w:rFonts w:ascii="Times New Roman" w:hAnsi="Times New Roman" w:cs="Times New Roman"/>
-          <w:spacing w:val="-24"/>
-          <w:sz w:val="24"/>
-        </w:rPr>
-        <w:t xml:space="preserve"> </w:t>
-      </w:r>
-      <w:r>
-        <w:rPr>
-          <w:rFonts w:ascii="Times New Roman" w:hAnsi="Times New Roman" w:cs="Times New Roman"/>
-          <w:spacing w:val="-2"/>
-          <w:sz w:val="24"/>
-        </w:rPr>
-        <w:t>command</w:t>
-      </w:r>
-      <w:r>
-        <w:rPr>
-          <w:rFonts w:ascii="Times New Roman" w:hAnsi="Times New Roman" w:cs="Times New Roman"/>
-          <w:spacing w:val="-24"/>
-          <w:sz w:val="24"/>
-        </w:rPr>
-        <w:t xml:space="preserve"> </w:t>
-      </w:r>
-      <w:r>
-        <w:rPr>
-          <w:rFonts w:ascii="Times New Roman" w:hAnsi="Times New Roman" w:cs="Times New Roman"/>
-          <w:spacing w:val="-2"/>
-          <w:sz w:val="24"/>
-        </w:rPr>
-        <w:t>shown</w:t>
-      </w:r>
-      <w:r>
-        <w:rPr>
-          <w:rFonts w:ascii="Times New Roman" w:hAnsi="Times New Roman" w:cs="Times New Roman"/>
-          <w:spacing w:val="-19"/>
-          <w:sz w:val="24"/>
-        </w:rPr>
-        <w:t xml:space="preserve"> </w:t>
-      </w:r>
-      <w:r>
-        <w:rPr>
-          <w:rFonts w:ascii="Times New Roman" w:hAnsi="Times New Roman" w:cs="Times New Roman"/>
-          <w:spacing w:val="-2"/>
-          <w:sz w:val="24"/>
-        </w:rPr>
-        <w:t>in</w:t>
-      </w:r>
-      <w:r>
-        <w:rPr>
-          <w:rFonts w:ascii="Times New Roman" w:hAnsi="Times New Roman" w:cs="Times New Roman"/>
-          <w:spacing w:val="-16"/>
-          <w:sz w:val="24"/>
-        </w:rPr>
-        <w:t xml:space="preserve"> </w:t>
-      </w:r>
-      <w:r>
-        <w:rPr>
-          <w:rFonts w:ascii="Times New Roman" w:hAnsi="Times New Roman" w:cs="Times New Roman"/>
-          <w:spacing w:val="-5"/>
-          <w:sz w:val="24"/>
-        </w:rPr>
-        <w:t>UI:</w:t>
-      </w:r>
-    </w:p>
-    <w:p>
-      <w:pPr>
-        <w:pStyle w:val="BodyText"/>
-        <w:spacing w:before="38" w:line="412" w:lineRule="auto"/>
-        <w:ind w:left="1800" w:right="401" w:firstLine="720"/>
-        <w:rPr>
-          <w:rFonts w:ascii="Times New Roman" w:hAnsi="Times New Roman" w:cs="Times New Roman"/>
-        </w:rPr>
-      </w:pPr>
-      <w:r>
-        <w:rPr>
-          <w:rFonts w:ascii="Times New Roman" w:hAnsi="Times New Roman" w:cs="Times New Roman"/>
-          <w:noProof/>
-        </w:rPr>
-        <w:drawing>
-          <wp:anchor distT="0" distB="0" distL="0" distR="0" simplePos="0" relativeHeight="487588352" behindDoc="1" locked="0" layoutInCell="1" allowOverlap="1" wp14:anchorId="79FB1548" wp14:editId="306C5FF9">
-            <wp:simplePos x="0" y="0"/>
-            <wp:positionH relativeFrom="page">
-              <wp:posOffset>911352</wp:posOffset>
-            </wp:positionH>
-            <wp:positionV relativeFrom="paragraph">
-              <wp:posOffset>666040</wp:posOffset>
-            </wp:positionV>
-            <wp:extent cx="5949696" cy="3291840"/>
-            <wp:effectExtent l="0" t="0" r="0" b="0"/>
-            <wp:wrapTopAndBottom/>
-            <wp:docPr id="3" name="Image 3"/>
-            <wp:cNvGraphicFramePr>
-              <a:graphicFrameLocks xmlns:a="http://schemas.openxmlformats.org/drawingml/2006/main"/>
-            </wp:cNvGraphicFramePr>
-            <a:graphic xmlns:a="http://schemas.openxmlformats.org/drawingml/2006/main">
-              <a:graphicData uri="http://schemas.openxmlformats.org/drawingml/2006/picture">
-                <pic:pic xmlns:pic="http://schemas.openxmlformats.org/drawingml/2006/picture">
-                  <pic:nvPicPr>
-                    <pic:cNvPr id="3" name="Image 3"/>
-                    <pic:cNvPicPr/>
-                  </pic:nvPicPr>
-                  <pic:blipFill>
-                    <a:blip r:embed="rId7" cstate="print"/>
-                    <a:stretch>
-                      <a:fillRect/>
-                    </a:stretch>
-                  </pic:blipFill>
-                  <pic:spPr>
-                    <a:xfrm>
-                      <a:off x="0" y="0"/>
-                      <a:ext cx="5949696" cy="3291840"/>
-                    </a:xfrm>
-                    <a:prstGeom prst="rect">
-                      <a:avLst/>
-                    </a:prstGeom>
-                  </pic:spPr>
-                </pic:pic>
-              </a:graphicData>
-            </a:graphic>
-          </wp:anchor>
-        </w:drawing>
-      </w:r>
-      <w:proofErr w:type="spellStart"/>
-      <w:r>
-        <w:rPr>
-          <w:rFonts w:ascii="Times New Roman" w:hAnsi="Times New Roman" w:cs="Times New Roman"/>
-          <w:spacing w:val="-4"/>
-        </w:rPr>
-        <w:t>sudo</w:t>
-      </w:r>
-      <w:proofErr w:type="spellEnd"/>
-      <w:r>
-        <w:rPr>
-          <w:rFonts w:ascii="Times New Roman" w:hAnsi="Times New Roman" w:cs="Times New Roman"/>
-          <w:spacing w:val="-27"/>
-        </w:rPr>
-        <w:t xml:space="preserve"> </w:t>
-      </w:r>
-      <w:r>
-        <w:rPr>
-          <w:rFonts w:ascii="Times New Roman" w:hAnsi="Times New Roman" w:cs="Times New Roman"/>
-          <w:spacing w:val="-4"/>
-        </w:rPr>
-        <w:t>docker</w:t>
-      </w:r>
-      <w:r>
-        <w:rPr>
-          <w:rFonts w:ascii="Times New Roman" w:hAnsi="Times New Roman" w:cs="Times New Roman"/>
-          <w:spacing w:val="-28"/>
-        </w:rPr>
-        <w:t xml:space="preserve"> </w:t>
-      </w:r>
-      <w:r>
-        <w:rPr>
-          <w:rFonts w:ascii="Times New Roman" w:hAnsi="Times New Roman" w:cs="Times New Roman"/>
-          <w:spacing w:val="-4"/>
-        </w:rPr>
-        <w:t>logs</w:t>
-      </w:r>
-      <w:r>
-        <w:rPr>
-          <w:rFonts w:ascii="Times New Roman" w:hAnsi="Times New Roman" w:cs="Times New Roman"/>
-          <w:spacing w:val="-25"/>
-        </w:rPr>
-        <w:t xml:space="preserve"> </w:t>
-      </w:r>
-      <w:r>
-        <w:rPr>
-          <w:rFonts w:ascii="Times New Roman" w:hAnsi="Times New Roman" w:cs="Times New Roman"/>
-          <w:spacing w:val="-4"/>
-        </w:rPr>
-        <w:t>&lt;</w:t>
-      </w:r>
-      <w:proofErr w:type="spellStart"/>
-      <w:r>
-        <w:rPr>
-          <w:rFonts w:ascii="Times New Roman" w:hAnsi="Times New Roman" w:cs="Times New Roman"/>
-          <w:spacing w:val="-4"/>
-        </w:rPr>
-        <w:t>container_id</w:t>
-      </w:r>
-      <w:proofErr w:type="spellEnd"/>
-      <w:r>
-        <w:rPr>
-          <w:rFonts w:ascii="Times New Roman" w:hAnsi="Times New Roman" w:cs="Times New Roman"/>
-          <w:spacing w:val="-4"/>
-        </w:rPr>
-        <w:t>&gt;</w:t>
-      </w:r>
-      <w:r>
-        <w:rPr>
-          <w:rFonts w:ascii="Times New Roman" w:hAnsi="Times New Roman" w:cs="Times New Roman"/>
-          <w:spacing w:val="-28"/>
-        </w:rPr>
-        <w:t xml:space="preserve"> </w:t>
-      </w:r>
-      <w:r>
-        <w:rPr>
-          <w:rFonts w:ascii="Times New Roman" w:hAnsi="Times New Roman" w:cs="Times New Roman"/>
-          <w:spacing w:val="-4"/>
-        </w:rPr>
-        <w:t>2&gt;C1</w:t>
-      </w:r>
-      <w:r>
-        <w:rPr>
-          <w:rFonts w:ascii="Times New Roman" w:hAnsi="Times New Roman" w:cs="Times New Roman"/>
-          <w:spacing w:val="-28"/>
-        </w:rPr>
-        <w:t xml:space="preserve"> </w:t>
-      </w:r>
-      <w:r>
-        <w:rPr>
-          <w:rFonts w:ascii="Times New Roman" w:hAnsi="Times New Roman" w:cs="Times New Roman"/>
-          <w:spacing w:val="-4"/>
-        </w:rPr>
-        <w:t>|</w:t>
-      </w:r>
-      <w:r>
-        <w:rPr>
-          <w:rFonts w:ascii="Times New Roman" w:hAnsi="Times New Roman" w:cs="Times New Roman"/>
-          <w:spacing w:val="-28"/>
-        </w:rPr>
-        <w:t xml:space="preserve"> </w:t>
-      </w:r>
-      <w:r>
-        <w:rPr>
-          <w:rFonts w:ascii="Times New Roman" w:hAnsi="Times New Roman" w:cs="Times New Roman"/>
-          <w:spacing w:val="-4"/>
-        </w:rPr>
-        <w:t>grep</w:t>
-      </w:r>
-      <w:r>
-        <w:rPr>
-          <w:rFonts w:ascii="Times New Roman" w:hAnsi="Times New Roman" w:cs="Times New Roman"/>
-          <w:spacing w:val="-25"/>
-        </w:rPr>
-        <w:t xml:space="preserve"> </w:t>
-      </w:r>
-      <w:r>
-        <w:rPr>
-          <w:rFonts w:ascii="Times New Roman" w:hAnsi="Times New Roman" w:cs="Times New Roman"/>
-          <w:spacing w:val="-4"/>
-        </w:rPr>
-        <w:t>"Bootstrap</w:t>
-      </w:r>
-      <w:r>
-        <w:rPr>
-          <w:rFonts w:ascii="Times New Roman" w:hAnsi="Times New Roman" w:cs="Times New Roman"/>
-          <w:spacing w:val="-25"/>
-        </w:rPr>
-        <w:t xml:space="preserve"> </w:t>
-      </w:r>
-      <w:r>
-        <w:rPr>
-          <w:rFonts w:ascii="Times New Roman" w:hAnsi="Times New Roman" w:cs="Times New Roman"/>
-          <w:spacing w:val="-4"/>
-        </w:rPr>
-        <w:t xml:space="preserve">Password" </w:t>
-      </w:r>
-      <w:r>
-        <w:rPr>
-          <w:rFonts w:ascii="Times New Roman" w:hAnsi="Times New Roman" w:cs="Times New Roman"/>
-        </w:rPr>
-        <w:t>Use</w:t>
-      </w:r>
-      <w:r>
-        <w:rPr>
-          <w:rFonts w:ascii="Times New Roman" w:hAnsi="Times New Roman" w:cs="Times New Roman"/>
-          <w:spacing w:val="-21"/>
-        </w:rPr>
-        <w:t xml:space="preserve"> </w:t>
-      </w:r>
-      <w:r>
-        <w:rPr>
-          <w:rFonts w:ascii="Times New Roman" w:hAnsi="Times New Roman" w:cs="Times New Roman"/>
-        </w:rPr>
-        <w:t>password</w:t>
-      </w:r>
-      <w:r>
-        <w:rPr>
-          <w:rFonts w:ascii="Times New Roman" w:hAnsi="Times New Roman" w:cs="Times New Roman"/>
-          <w:spacing w:val="-21"/>
-        </w:rPr>
-        <w:t xml:space="preserve"> </w:t>
-      </w:r>
-      <w:r>
-        <w:rPr>
-          <w:rFonts w:ascii="Times New Roman" w:hAnsi="Times New Roman" w:cs="Times New Roman"/>
-        </w:rPr>
-        <w:t>→</w:t>
-      </w:r>
-      <w:r>
-        <w:rPr>
-          <w:rFonts w:ascii="Times New Roman" w:hAnsi="Times New Roman" w:cs="Times New Roman"/>
-          <w:spacing w:val="-21"/>
-        </w:rPr>
-        <w:t xml:space="preserve"> </w:t>
-      </w:r>
-      <w:r>
-        <w:rPr>
-          <w:rFonts w:ascii="Times New Roman" w:hAnsi="Times New Roman" w:cs="Times New Roman"/>
-        </w:rPr>
-        <w:t>set</w:t>
-      </w:r>
-      <w:r>
-        <w:rPr>
-          <w:rFonts w:ascii="Times New Roman" w:hAnsi="Times New Roman" w:cs="Times New Roman"/>
-          <w:spacing w:val="-16"/>
-        </w:rPr>
-        <w:t xml:space="preserve"> </w:t>
-      </w:r>
-      <w:r>
-        <w:rPr>
-          <w:rFonts w:ascii="Times New Roman" w:hAnsi="Times New Roman" w:cs="Times New Roman"/>
-        </w:rPr>
-        <w:t>your</w:t>
-      </w:r>
-      <w:r>
-        <w:rPr>
-          <w:rFonts w:ascii="Times New Roman" w:hAnsi="Times New Roman" w:cs="Times New Roman"/>
-          <w:spacing w:val="-22"/>
-        </w:rPr>
-        <w:t xml:space="preserve"> </w:t>
-      </w:r>
-      <w:r>
-        <w:rPr>
-          <w:rFonts w:ascii="Times New Roman" w:hAnsi="Times New Roman" w:cs="Times New Roman"/>
-        </w:rPr>
-        <w:t>own</w:t>
-      </w:r>
-      <w:r>
-        <w:rPr>
-          <w:rFonts w:ascii="Times New Roman" w:hAnsi="Times New Roman" w:cs="Times New Roman"/>
-          <w:spacing w:val="-21"/>
-        </w:rPr>
-        <w:t xml:space="preserve"> </w:t>
-      </w:r>
-      <w:r>
-        <w:rPr>
-          <w:rFonts w:ascii="Times New Roman" w:hAnsi="Times New Roman" w:cs="Times New Roman"/>
-        </w:rPr>
-        <w:t>admin</w:t>
-      </w:r>
-      <w:r>
-        <w:rPr>
-          <w:rFonts w:ascii="Times New Roman" w:hAnsi="Times New Roman" w:cs="Times New Roman"/>
-          <w:spacing w:val="-21"/>
-        </w:rPr>
-        <w:t xml:space="preserve"> </w:t>
-      </w:r>
-      <w:r>
-        <w:rPr>
-          <w:rFonts w:ascii="Times New Roman" w:hAnsi="Times New Roman" w:cs="Times New Roman"/>
-        </w:rPr>
-        <w:t>password.</w:t>
-      </w:r>
-    </w:p>
-    <w:p>
-      <w:pPr>
-        <w:pStyle w:val="Heading1"/>
-        <w:numPr>
-          <w:ilvl w:val="0"/>
-          <w:numId w:val="6"/>
-        </w:numPr>
         <w:tabs>
           <w:tab w:val="left" w:pos="607"/>
         </w:tabs>
         <w:spacing w:before="201"/>
-        <w:ind w:left="607" w:hanging="247"/>
-        <w:jc w:val="left"/>
-        <w:rPr>
-          <w:rFonts w:ascii="Times New Roman" w:hAnsi="Times New Roman" w:cs="Times New Roman"/>
-        </w:rPr>
-      </w:pPr>
-      <w:r>
-        <w:rPr>
-          <w:rFonts w:ascii="Times New Roman" w:hAnsi="Times New Roman" w:cs="Times New Roman"/>
-          <w:w w:val="90"/>
-        </w:rPr>
+        <w:ind w:left="0"/>
+        <w:rPr>
+          <w:rFonts w:ascii="Times New Roman" w:hAnsi="Times New Roman" w:cs="Times New Roman"/>
+        </w:rPr>
+      </w:pPr>
+      <w:r>
+        <w:rPr>
+          <w:rFonts w:ascii="Times New Roman" w:hAnsi="Times New Roman" w:cs="Times New Roman"/>
+          <w:w w:val="90"/>
+        </w:rPr>
+        <w:lastRenderedPageBreak/>
         <w:t>Create</w:t>
       </w:r>
       <w:r>
@@ -4621,7 +4105,7 @@
           <w:rFonts w:ascii="Times New Roman" w:hAnsi="Times New Roman" w:cs="Times New Roman"/>
         </w:rPr>
       </w:pPr>
-      <w:hyperlink r:id="rId8">
+      <w:hyperlink r:id="rId6">
         <w:r>
           <w:rPr>
             <w:rFonts w:ascii="Times New Roman" w:hAnsi="Times New Roman" w:cs="Times New Roman"/>
@@ -4672,7 +4156,7 @@
                     <pic:cNvPicPr/>
                   </pic:nvPicPr>
                   <pic:blipFill>
-                    <a:blip r:embed="rId9" cstate="print"/>
+                    <a:blip r:embed="rId7" cstate="print"/>
                     <a:stretch>
                       <a:fillRect/>
                     </a:stretch>
@@ -4739,7 +4223,7 @@
                     <pic:cNvPicPr/>
                   </pic:nvPicPr>
                   <pic:blipFill>
-                    <a:blip r:embed="rId10" cstate="print"/>
+                    <a:blip r:embed="rId8" cstate="print"/>
                     <a:stretch>
                       <a:fillRect/>
                     </a:stretch>
@@ -7759,7 +7243,7 @@
                     <pic:cNvPicPr/>
                   </pic:nvPicPr>
                   <pic:blipFill>
-                    <a:blip r:embed="rId11" cstate="print"/>
+                    <a:blip r:embed="rId9" cstate="print"/>
                     <a:stretch>
                       <a:fillRect/>
                     </a:stretch>
@@ -8103,7 +7587,7 @@
         </w:rPr>
         <w:t xml:space="preserve"> </w:t>
       </w:r>
-      <w:hyperlink r:id="rId12">
+      <w:hyperlink r:id="rId10">
         <w:r>
           <w:rPr>
             <w:rFonts w:ascii="Times New Roman" w:hAnsi="Times New Roman" w:cs="Times New Roman"/>
@@ -9485,7 +8969,7 @@
                     <pic:cNvPicPr/>
                   </pic:nvPicPr>
                   <pic:blipFill>
-                    <a:blip r:embed="rId13" cstate="print"/>
+                    <a:blip r:embed="rId11" cstate="print"/>
                     <a:stretch>
                       <a:fillRect/>
                     </a:stretch>
@@ -9871,7 +9355,7 @@
                     <pic:cNvPicPr/>
                   </pic:nvPicPr>
                   <pic:blipFill>
-                    <a:blip r:embed="rId14" cstate="print"/>
+                    <a:blip r:embed="rId12" cstate="print"/>
                     <a:stretch>
                       <a:fillRect/>
                     </a:stretch>

</xml_diff>